<commit_message>
Update CVs and portfolio experience
</commit_message>
<xml_diff>
--- a/Franklyn_Vasquez_CV_EN.docx
+++ b/Franklyn_Vasquez_CV_EN.docx
@@ -143,7 +143,7 @@
         <w:jc w:val="both"/>
       </w:pPr>
       <w:r>
-        <w:t>Systems Engineer with 5+ years of experience in IT infrastructure, cloud administration, virtualization, cybersecurity, DevOps tools, and enterprise support. Experienced in Windows Server, VMware, Active Directory, GPO, Linux, cloud platforms, GitHub, Docker, Kubernetes, CI/CD, SQL, and application development. Hands-on personal projects include a remote IT management platform and a published Android learning application, demonstrating software development, product delivery, system integration, and user-focused design. Strong background in technical documentation, troubleshooting, staff training, and IT service delivery.</w:t>
+        <w:t>Systems Engineer with 5+ years of experience in IT infrastructure, cloud administration, virtualization, cybersecurity, DevOps tools, and enterprise support. Experienced in Windows Server, VMware, Active Directory, GPO, Linux, cloud platforms, GitHub, Docker, Kubernetes, CI/CD, SQL, and application development. Hands-on personal projects include published Android applications, demonstrating software development, product delivery, system integration, and user-focused design. Strong background in technical documentation, troubleshooting, staff training, and IT service delivery.</w:t>
       </w:r>
     </w:p>
     <w:p>
@@ -470,10 +470,7 @@
         <w:spacing w:after="0"/>
       </w:pPr>
       <w:r>
-        <w:t>Docker, Kubernetes, Jenkins, Git, GitHub, CI/CD pipelines</w:t>
-      </w:r>
-      <w:r>
-        <w:t>.</w:t>
+        <w:t>Docker, Kubernetes, Jenkins, Ansible, Git, GitHub, CI/CD pipelines.</w:t>
       </w:r>
     </w:p>
     <w:p>
@@ -854,57 +851,6 @@
         </w:rPr>
         <w:t>PERSONAL PROJECT</w:t>
       </w:r>
-    </w:p>
-    <w:p>
-      <w:pPr>
-        <w:keepNext/>
-        <w:spacing w:before="80" w:after="0"/>
-        <w:rPr>
-          <w:i/>
-          <w:sz w:val="20"/>
-        </w:rPr>
-      </w:pPr>
-      <w:r>
-        <w:rPr>
-          <w:b/>
-          <w:color w:val="366092"/>
-          <w:sz w:val="22"/>
-        </w:rPr>
-        <w:t>Remotely-X Remote Management Platform | Personal Project</w:t>
-      </w:r>
-    </w:p>
-    <w:p>
-      <w:pPr>
-        <w:numPr>
-          <w:ilvl w:val="0"/>
-          <w:numId w:val="11"/>
-        </w:numPr>
-        <w:spacing w:before="80" w:after="0"/>
-      </w:pPr>
-      <w:r>
-        <w:t>Developing a remote IT management and support-oriented platform demonstrating remote access, remote shell, remote desktop, remote file explorer, user management, and IT service delivery concepts.</w:t>
-      </w:r>
-    </w:p>
-    <w:p>
-      <w:pPr>
-        <w:numPr>
-          <w:ilvl w:val="0"/>
-          <w:numId w:val="11"/>
-        </w:numPr>
-        <w:spacing w:before="80" w:after="0"/>
-      </w:pPr>
-      <w:r>
-        <w:t xml:space="preserve">Project website: </w:t>
-      </w:r>
-      <w:hyperlink r:id="rId10" w:history="1">
-        <w:r>
-          <w:rPr>
-            <w:rStyle w:val="Hyperlink"/>
-            <w:color w:val="0563C1"/>
-          </w:rPr>
-          <w:t>https://remotely-x.com/</w:t>
-        </w:r>
-      </w:hyperlink>
     </w:p>
     <w:p>
       <w:pPr>
@@ -1120,6 +1066,120 @@
           <w:color w:val="1F4E79"/>
         </w:rPr>
         <w:t>PROFESSIONAL EXPERIENCE</w:t>
+      </w:r>
+    </w:p>
+    <w:p>
+      <w:pPr>
+        <w:keepNext/>
+        <w:spacing w:before="80" w:after="0"/>
+        <w:rPr>
+          <w:i/>
+          <w:sz w:val="20"/>
+        </w:rPr>
+      </w:pPr>
+      <w:r>
+        <w:rPr>
+          <w:b/>
+          <w:color w:val="366092"/>
+          <w:sz w:val="22"/>
+        </w:rPr>
+        <w:t>Technical Support Intern | eStruxture Data Centers</w:t>
+      </w:r>
+      <w:r>
+        <w:rPr>
+          <w:b/>
+          <w:color w:val="366092"/>
+          <w:sz w:val="22"/>
+        </w:rPr>
+        <w:t xml:space="preserve">  •  </w:t>
+      </w:r>
+      <w:r>
+        <w:rPr>
+          <w:i/>
+          <w:sz w:val="20"/>
+        </w:rPr>
+        <w:t>Jul 2026 - Sep 2026</w:t>
+      </w:r>
+    </w:p>
+    <w:p>
+      <w:pPr>
+        <w:keepNext/>
+        <w:spacing w:before="80" w:after="0"/>
+      </w:pPr>
+      <w:r>
+        <w:t>Internship - Montreal, Quebec, Canada - On-site</w:t>
+      </w:r>
+    </w:p>
+    <w:p>
+      <w:pPr>
+        <w:numPr>
+          <w:ilvl w:val="0"/>
+          <w:numId w:val="10"/>
+        </w:numPr>
+        <w:spacing w:before="80" w:after="0"/>
+      </w:pPr>
+      <w:r>
+        <w:t>Provided hands-on IT support in a data center environment, troubleshooting Windows laptops, software, hardware, printers, and user access issues.</w:t>
+      </w:r>
+    </w:p>
+    <w:p>
+      <w:pPr>
+        <w:numPr>
+          <w:ilvl w:val="0"/>
+          <w:numId w:val="10"/>
+        </w:numPr>
+        <w:spacing w:before="80" w:after="0"/>
+      </w:pPr>
+      <w:r>
+        <w:t>Deployed and configured Windows laptops, installed corporate applications, and prepared devices for new and existing employees.</w:t>
+      </w:r>
+    </w:p>
+    <w:p>
+      <w:pPr>
+        <w:numPr>
+          <w:ilvl w:val="0"/>
+          <w:numId w:val="10"/>
+        </w:numPr>
+        <w:spacing w:before="80" w:after="0"/>
+      </w:pPr>
+      <w:r>
+        <w:t>Used KACE for software deployment, inventory management, scripting, system maintenance, and troubleshooting.</w:t>
+      </w:r>
+    </w:p>
+    <w:p>
+      <w:pPr>
+        <w:numPr>
+          <w:ilvl w:val="0"/>
+          <w:numId w:val="10"/>
+        </w:numPr>
+        <w:spacing w:before="80" w:after="0"/>
+      </w:pPr>
+      <w:r>
+        <w:t>Supported endpoint security operations using ESET Protect, ESET Full Disk Encryption, BitLocker, and security policies.</w:t>
+      </w:r>
+    </w:p>
+    <w:p>
+      <w:pPr>
+        <w:numPr>
+          <w:ilvl w:val="0"/>
+          <w:numId w:val="10"/>
+        </w:numPr>
+        <w:spacing w:before="80" w:after="0"/>
+      </w:pPr>
+      <w:r>
+        <w:t>Assisted with application deployment and troubleshooting for Avigilon, CCure, BioConnect, 8x8 Work, and other enterprise applications.</w:t>
+      </w:r>
+    </w:p>
+    <w:p>
+      <w:pPr>
+        <w:numPr>
+          <w:ilvl w:val="0"/>
+          <w:numId w:val="10"/>
+        </w:numPr>
+        <w:spacing w:before="80" w:after="0"/>
+      </w:pPr>
+      <w:r>
+        <w:t>Performed software and hardware inventory reviews, identified unsupported applications, and assisted with remediation activities.</w:t>
       </w:r>
     </w:p>
     <w:p>

</xml_diff>

<commit_message>
Replace RT TECH experience with freelance consulting
</commit_message>
<xml_diff>
--- a/Franklyn_Vasquez_CV_EN.docx
+++ b/Franklyn_Vasquez_CV_EN.docx
@@ -1193,65 +1193,16 @@
       <w:r>
         <w:rPr>
           <w:b/>
-          <w:color w:val="366092"/>
           <w:sz w:val="22"/>
         </w:rPr>
-        <w:t xml:space="preserve">Systems </w:t>
-      </w:r>
-      <w:r>
-        <w:rPr>
-          <w:b/>
-          <w:color w:val="366092"/>
-          <w:sz w:val="22"/>
-        </w:rPr>
-        <w:t>Engineer</w:t>
-      </w:r>
-      <w:r>
-        <w:rPr>
-          <w:b/>
-          <w:color w:val="366092"/>
-          <w:sz w:val="22"/>
-        </w:rPr>
-        <w:t xml:space="preserve"> | RT </w:t>
-      </w:r>
-      <w:proofErr w:type="gramStart"/>
-      <w:r>
-        <w:rPr>
-          <w:b/>
-          <w:color w:val="366092"/>
-          <w:sz w:val="22"/>
-        </w:rPr>
-        <w:t>TECH</w:t>
+        <w:t>Freelance Information Technology Consultant</w:t>
       </w:r>
       <w:r>
         <w:rPr>
           <w:i/>
           <w:sz w:val="20"/>
         </w:rPr>
-        <w:t xml:space="preserve">  </w:t>
-      </w:r>
-      <w:r>
-        <w:rPr>
-          <w:b/>
-          <w:color w:val="366092"/>
-          <w:sz w:val="22"/>
-        </w:rPr>
-        <w:t>—</w:t>
-      </w:r>
-      <w:proofErr w:type="gramEnd"/>
-      <w:r>
-        <w:rPr>
-          <w:i/>
-          <w:sz w:val="20"/>
-        </w:rPr>
-        <w:t xml:space="preserve">  Feb 2019 – Oct 202</w:t>
-      </w:r>
-      <w:r>
-        <w:rPr>
-          <w:i/>
-          <w:sz w:val="20"/>
-        </w:rPr>
-        <w:t>4</w:t>
+        <w:t xml:space="preserve">  -  Feb 2019 - Oct 2023</w:t>
       </w:r>
     </w:p>
     <w:p>
@@ -1263,7 +1214,7 @@
         <w:spacing w:before="80" w:after="0"/>
       </w:pPr>
       <w:r>
-        <w:t xml:space="preserve">Administered and supported Windows Server 2016/2022 environments, ensuring system stability, availability, and security across enterprise infrastructure. </w:t>
+        <w:t>Provided freelance IT systems administration, cloud technology support, and software development services, combining infrastructure management with application development.</w:t>
       </w:r>
     </w:p>
     <w:p>
@@ -1275,7 +1226,7 @@
         <w:spacing w:before="80" w:after="0"/>
       </w:pPr>
       <w:r>
-        <w:t xml:space="preserve">Managed and maintained VMware virtual machines, including provisioning, configuration, resource allocation, and performance monitoring. </w:t>
+        <w:t>Administered and supported Windows Server 2016/2022, Active Directory, Group Policy (GPO), Microsoft 365, and VMware virtualized environments, focusing on reliability, performance, and security.</w:t>
       </w:r>
     </w:p>
     <w:p>
@@ -1287,7 +1238,7 @@
         <w:spacing w:before="80" w:after="0"/>
       </w:pPr>
       <w:r>
-        <w:t xml:space="preserve">Implemented and supported Group Policy Objects (GPOs) to enforce security settings, system configurations, and vulnerability remediation across Windows environments. </w:t>
+        <w:t>Developed and maintained software applications using C#/.NET and Microsoft SQL Server, including database management, troubleshooting, and business application improvements.</w:t>
       </w:r>
     </w:p>
     <w:p>
@@ -1299,7 +1250,7 @@
         <w:spacing w:before="80" w:after="0"/>
       </w:pPr>
       <w:r>
-        <w:t xml:space="preserve">Performed vulnerability remediation and server hardening activities following security best practices and compliance standards. </w:t>
+        <w:t>Supported cloud-connected environments, Microsoft 365 services, identity and access management, system configuration, and infrastructure troubleshooting.</w:t>
       </w:r>
     </w:p>
     <w:p>
@@ -1311,7 +1262,7 @@
         <w:spacing w:before="80" w:after="0"/>
       </w:pPr>
       <w:r>
-        <w:t xml:space="preserve">Supported patch management, system updates, and upgrade activities for Windows servers and enterprise systems to maintain security and operational reliability. </w:t>
+        <w:t>Used PowerShell and scripting techniques to automate IT administration tasks, improve operational efficiency, and streamline technical processes.</w:t>
       </w:r>
     </w:p>
     <w:p>
@@ -1323,7 +1274,7 @@
         <w:spacing w:before="80" w:after="0"/>
       </w:pPr>
       <w:r>
-        <w:t xml:space="preserve">Troubleshot and resolved L2/L3 Windows infrastructure issues, including OS, performance, connectivity, permissions, and server-related incidents. </w:t>
+        <w:t>Provided Level 2 and Level 3 technical support, resolving Windows, networking, application, permissions, and infrastructure issues.</w:t>
       </w:r>
     </w:p>
     <w:p>
@@ -1335,7 +1286,7 @@
         <w:spacing w:before="80" w:after="0"/>
       </w:pPr>
       <w:r>
-        <w:t xml:space="preserve">Provided support for Exchange and Microsoft 365 / Office 365 issues, including mail access, Outlook connectivity, and user-related administration tasks. </w:t>
+        <w:t>Worked on software integration, system maintenance, performance optimization, technical documentation, and the implementation of reliable IT solutions.</w:t>
       </w:r>
     </w:p>
     <w:p>
@@ -1347,55 +1298,21 @@
         <w:spacing w:before="80" w:after="0"/>
       </w:pPr>
       <w:r>
-        <w:t xml:space="preserve">Managed Active Directory administration tasks such as user accounts, permissions, password resets, group membership, and access control. </w:t>
+        <w:t>Combined software engineering and IT infrastructure expertise to support business operations, improve system functionality, and deliver practical technology solutions.</w:t>
       </w:r>
     </w:p>
     <w:p>
       <w:pPr>
-        <w:numPr>
-          <w:ilvl w:val="0"/>
-          <w:numId w:val="10"/>
-        </w:numPr>
         <w:spacing w:before="80" w:after="0"/>
       </w:pPr>
       <w:r>
-        <w:t xml:space="preserve">Monitored system health, including CPU, memory, disk, and network utilization, and performed corrective actions to optimize performance and uptime. </w:t>
-      </w:r>
-    </w:p>
-    <w:p>
-      <w:pPr>
-        <w:numPr>
-          <w:ilvl w:val="0"/>
-          <w:numId w:val="10"/>
-        </w:numPr>
-        <w:spacing w:before="80" w:after="0"/>
-      </w:pPr>
-      <w:r>
-        <w:t xml:space="preserve">Created and maintained technical documentation, troubleshooting procedures, and support records to improve operational efficiency and knowledge sharing. </w:t>
-      </w:r>
-    </w:p>
-    <w:p>
-      <w:pPr>
-        <w:numPr>
-          <w:ilvl w:val="0"/>
-          <w:numId w:val="10"/>
-        </w:numPr>
-        <w:spacing w:before="80" w:after="0"/>
-      </w:pPr>
-      <w:r>
-        <w:t xml:space="preserve">Collaborated with support teams and stakeholders to resolve escalated incidents, support production environments, and meet service expectations. </w:t>
-      </w:r>
-    </w:p>
-    <w:p>
-      <w:pPr>
-        <w:numPr>
-          <w:ilvl w:val="0"/>
-          <w:numId w:val="10"/>
-        </w:numPr>
-        <w:spacing w:before="80" w:after="0"/>
-      </w:pPr>
-      <w:r>
-        <w:t xml:space="preserve">Provided mentorship and technical guidance to junior team members during troubleshooting and daily support operations. </w:t>
+        <w:rPr>
+          <w:b/>
+        </w:rPr>
+        <w:t xml:space="preserve">Core Technologies: </w:t>
+      </w:r>
+      <w:r>
+        <w:t>C#, .NET, SQL Server, Windows Server, VMware, Active Directory, Group Policy, Microsoft 365, PowerShell, IT Infrastructure, Cloud Administration, Software Development, REST APIs.</w:t>
       </w:r>
     </w:p>
     <w:p>

</xml_diff>

<commit_message>
Correct experience and education dates
</commit_message>
<xml_diff>
--- a/Franklyn_Vasquez_CV_EN.docx
+++ b/Franklyn_Vasquez_CV_EN.docx
@@ -1195,14 +1195,14 @@
           <w:b/>
           <w:sz w:val="22"/>
         </w:rPr>
-        <w:t>Freelance Information Technology Consultant</w:t>
+        <w:t>Professional Development &amp; Technical Studies | Longueuil, Quebec, Canada</w:t>
       </w:r>
       <w:r>
         <w:rPr>
           <w:i/>
           <w:sz w:val="20"/>
         </w:rPr>
-        <w:t xml:space="preserve">  -  Feb 2019 - Oct 2023</w:t>
+        <w:t xml:space="preserve">  -  Oct 2024 - Jun 2026</w:t>
       </w:r>
     </w:p>
     <w:p>
@@ -1214,7 +1214,30 @@
         <w:spacing w:before="80" w:after="0"/>
       </w:pPr>
       <w:r>
-        <w:t>Provided freelance IT systems administration, cloud technology support, and software development services, combining infrastructure management with application development.</w:t>
+        <w:t>Pursued two AEC programs at Champlain College: Cybersecurity (graduated February 2026) and IT Cloud Administration (graduated September 2026).</w:t>
+      </w:r>
+    </w:p>
+    <w:p>
+      <w:pPr>
+        <w:spacing w:before="80" w:after="0"/>
+        <w:rPr>
+          <w:i/>
+          <w:sz w:val="20"/>
+        </w:rPr>
+      </w:pPr>
+      <w:r>
+        <w:rPr>
+          <w:b/>
+          <w:sz w:val="22"/>
+        </w:rPr>
+        <w:t>Freelance Information Technology Consultant</w:t>
+      </w:r>
+      <w:r>
+        <w:rPr>
+          <w:i/>
+          <w:sz w:val="20"/>
+        </w:rPr>
+        <w:t xml:space="preserve">  -  Apr 2019 - Sep 2024</w:t>
       </w:r>
     </w:p>
     <w:p>
@@ -1226,7 +1249,7 @@
         <w:spacing w:before="80" w:after="0"/>
       </w:pPr>
       <w:r>
-        <w:t>Administered and supported Windows Server 2016/2022, Active Directory, Group Policy (GPO), Microsoft 365, and VMware virtualized environments, focusing on reliability, performance, and security.</w:t>
+        <w:t>Provided freelance IT systems administration, cloud technology support, and software development services, combining infrastructure management with application development.</w:t>
       </w:r>
     </w:p>
     <w:p>
@@ -1238,7 +1261,7 @@
         <w:spacing w:before="80" w:after="0"/>
       </w:pPr>
       <w:r>
-        <w:t>Developed and maintained software applications using C#/.NET and Microsoft SQL Server, including database management, troubleshooting, and business application improvements.</w:t>
+        <w:t>Administered and supported Windows Server 2016/2022, Active Directory, Group Policy (GPO), Microsoft 365, and VMware virtualized environments, focusing on reliability, performance, and security.</w:t>
       </w:r>
     </w:p>
     <w:p>
@@ -1250,7 +1273,7 @@
         <w:spacing w:before="80" w:after="0"/>
       </w:pPr>
       <w:r>
-        <w:t>Supported cloud-connected environments, Microsoft 365 services, identity and access management, system configuration, and infrastructure troubleshooting.</w:t>
+        <w:t>Developed and maintained software applications using C#/.NET and Microsoft SQL Server, including database management, troubleshooting, and business application improvements.</w:t>
       </w:r>
     </w:p>
     <w:p>
@@ -1262,7 +1285,7 @@
         <w:spacing w:before="80" w:after="0"/>
       </w:pPr>
       <w:r>
-        <w:t>Used PowerShell and scripting techniques to automate IT administration tasks, improve operational efficiency, and streamline technical processes.</w:t>
+        <w:t>Supported cloud-connected environments, Microsoft 365 services, identity and access management, system configuration, and infrastructure troubleshooting.</w:t>
       </w:r>
     </w:p>
     <w:p>
@@ -1274,7 +1297,7 @@
         <w:spacing w:before="80" w:after="0"/>
       </w:pPr>
       <w:r>
-        <w:t>Provided Level 2 and Level 3 technical support, resolving Windows, networking, application, permissions, and infrastructure issues.</w:t>
+        <w:t>Used PowerShell and scripting techniques to automate IT administration tasks, improve operational efficiency, and streamline technical processes.</w:t>
       </w:r>
     </w:p>
     <w:p>
@@ -1286,7 +1309,7 @@
         <w:spacing w:before="80" w:after="0"/>
       </w:pPr>
       <w:r>
-        <w:t>Worked on software integration, system maintenance, performance optimization, technical documentation, and the implementation of reliable IT solutions.</w:t>
+        <w:t>Provided Level 2 and Level 3 technical support, resolving Windows, networking, application, permissions, and infrastructure issues.</w:t>
       </w:r>
     </w:p>
     <w:p>
@@ -1298,6 +1321,18 @@
         <w:spacing w:before="80" w:after="0"/>
       </w:pPr>
       <w:r>
+        <w:t>Worked on software integration, system maintenance, performance optimization, technical documentation, and the implementation of reliable IT solutions.</w:t>
+      </w:r>
+    </w:p>
+    <w:p>
+      <w:pPr>
+        <w:numPr>
+          <w:ilvl w:val="0"/>
+          <w:numId w:val="10"/>
+        </w:numPr>
+        <w:spacing w:before="80" w:after="0"/>
+      </w:pPr>
+      <w:r>
         <w:t>Combined software engineering and IT infrastructure expertise to support business operations, improve system functionality, and deliver practical technology solutions.</w:t>
       </w:r>
     </w:p>
@@ -1318,6 +1353,65 @@
     <w:p>
       <w:pPr>
         <w:spacing w:before="80" w:after="0"/>
+      </w:pPr>
+      <w:r>
+        <w:rPr>
+          <w:b/>
+          <w:sz w:val="22"/>
+        </w:rPr>
+        <w:t>Process Engineer | PDVSA | Petroleum Refinery</w:t>
+      </w:r>
+      <w:r>
+        <w:rPr>
+          <w:i/>
+          <w:sz w:val="20"/>
+        </w:rPr>
+        <w:t xml:space="preserve">  -  May 2014 - Apr 2019</w:t>
+      </w:r>
+    </w:p>
+    <w:p>
+      <w:pPr>
+        <w:spacing w:after="0"/>
+        <w:ind w:left="317" w:hanging="230"/>
+        <w:jc w:val="both"/>
+      </w:pPr>
+      <w:r>
+        <w:rPr>
+          <w:sz w:val="20"/>
+        </w:rPr>
+        <w:t>• Coordinated operational information and supported process documentation for plant activities across multiple departments.</w:t>
+      </w:r>
+    </w:p>
+    <w:p>
+      <w:pPr>
+        <w:spacing w:after="0"/>
+        <w:ind w:left="317" w:hanging="230"/>
+        <w:jc w:val="both"/>
+      </w:pPr>
+      <w:r>
+        <w:rPr>
+          <w:sz w:val="20"/>
+        </w:rPr>
+        <w:t>• Prepared technical and routine reports to support monitoring, compliance, and decision-making.</w:t>
+      </w:r>
+    </w:p>
+    <w:p>
+      <w:pPr>
+        <w:spacing w:after="0"/>
+        <w:ind w:left="317" w:hanging="230"/>
+        <w:jc w:val="both"/>
+      </w:pPr>
+      <w:r>
+        <w:rPr>
+          <w:sz w:val="20"/>
+        </w:rPr>
+        <w:t>• Maintained process records and collaborated with teams to improve workflow efficiency and control standards.</w:t>
+      </w:r>
+    </w:p>
+    <w:p>
+      <w:pPr>
+        <w:spacing w:before="80" w:after="0"/>
+        <w:jc w:val="both"/>
       </w:pPr>
       <w:r>
         <w:rPr>
@@ -1325,8 +1419,7 @@
           <w:color w:val="366092"/>
           <w:sz w:val="22"/>
         </w:rPr>
-        <w:lastRenderedPageBreak/>
-        <w:t xml:space="preserve">Process Engineer | </w:t>
+        <w:t xml:space="preserve">ERP Analyst | </w:t>
       </w:r>
       <w:r>
         <w:rPr>
@@ -1334,22 +1427,14 @@
           <w:color w:val="366092"/>
           <w:sz w:val="22"/>
         </w:rPr>
-        <w:t xml:space="preserve">PDVSA | </w:t>
-      </w:r>
-      <w:r>
-        <w:rPr>
-          <w:b/>
-          <w:color w:val="366092"/>
-          <w:sz w:val="22"/>
-        </w:rPr>
-        <w:t>Petroleum Refinery</w:t>
+        <w:t>PDVSA | Petroleum Refinery</w:t>
       </w:r>
       <w:r>
         <w:rPr>
           <w:i/>
           <w:sz w:val="20"/>
         </w:rPr>
-        <w:t xml:space="preserve"> </w:t>
+        <w:t xml:space="preserve">    </w:t>
       </w:r>
       <w:r>
         <w:rPr>
@@ -1364,7 +1449,7 @@
           <w:i/>
           <w:sz w:val="20"/>
         </w:rPr>
-        <w:t xml:space="preserve"> May 2014 – Feb 2019</w:t>
+        <w:t xml:space="preserve">    Mar 2013 – May 2014</w:t>
       </w:r>
     </w:p>
     <w:p>
@@ -1377,7 +1462,7 @@
         <w:rPr>
           <w:sz w:val="20"/>
         </w:rPr>
-        <w:t>• Coordinated operational information and supported process documentation for plant activities across multiple departments.</w:t>
+        <w:t>• Supported ERP operations, data maintenance, user requests, and testing activities to ensure reliable business system performance.</w:t>
       </w:r>
     </w:p>
     <w:p>
@@ -1390,20 +1475,7 @@
         <w:rPr>
           <w:sz w:val="20"/>
         </w:rPr>
-        <w:t>• Prepared technical and routine reports to support monitoring, compliance, and decision-making.</w:t>
-      </w:r>
-    </w:p>
-    <w:p>
-      <w:pPr>
-        <w:spacing w:after="0"/>
-        <w:ind w:left="317" w:hanging="230"/>
-        <w:jc w:val="both"/>
-      </w:pPr>
-      <w:r>
-        <w:rPr>
-          <w:sz w:val="20"/>
-        </w:rPr>
-        <w:t>• Maintained process records and collaborated with teams to improve workflow efficiency and control standards.</w:t>
+        <w:t>• Assisted with issue resolution, documentation, and coordination of system updates.</w:t>
       </w:r>
     </w:p>
     <w:p>
@@ -1417,7 +1489,7 @@
           <w:color w:val="366092"/>
           <w:sz w:val="22"/>
         </w:rPr>
-        <w:t xml:space="preserve">ERP Analyst | </w:t>
+        <w:t>Computer Trainer |</w:t>
       </w:r>
       <w:r>
         <w:rPr>
@@ -1425,14 +1497,39 @@
           <w:color w:val="366092"/>
           <w:sz w:val="22"/>
         </w:rPr>
-        <w:t>PDVSA | Petroleum Refinery</w:t>
+        <w:t xml:space="preserve"> MPPE</w:t>
       </w:r>
       <w:r>
         <w:rPr>
-          <w:i/>
-          <w:sz w:val="20"/>
+          <w:b/>
+          <w:color w:val="366092"/>
+          <w:sz w:val="22"/>
         </w:rPr>
-        <w:t xml:space="preserve">    </w:t>
+        <w:t xml:space="preserve"> </w:t>
+      </w:r>
+      <w:r>
+        <w:rPr>
+          <w:b/>
+          <w:color w:val="366092"/>
+          <w:sz w:val="22"/>
+        </w:rPr>
+        <w:t xml:space="preserve">| </w:t>
+      </w:r>
+      <w:r>
+        <w:rPr>
+          <w:b/>
+          <w:color w:val="366092"/>
+          <w:sz w:val="22"/>
+        </w:rPr>
+        <w:t>Ministry of Education</w:t>
+      </w:r>
+      <w:r>
+        <w:rPr>
+          <w:b/>
+          <w:color w:val="366092"/>
+          <w:sz w:val="22"/>
+        </w:rPr>
+        <w:t xml:space="preserve"> </w:t>
       </w:r>
       <w:r>
         <w:rPr>
@@ -1447,101 +1544,6 @@
           <w:i/>
           <w:sz w:val="20"/>
         </w:rPr>
-        <w:t xml:space="preserve">    Mar 2013 – May 2014</w:t>
-      </w:r>
-    </w:p>
-    <w:p>
-      <w:pPr>
-        <w:spacing w:after="0"/>
-        <w:ind w:left="317" w:hanging="230"/>
-        <w:jc w:val="both"/>
-      </w:pPr>
-      <w:r>
-        <w:rPr>
-          <w:sz w:val="20"/>
-        </w:rPr>
-        <w:t>• Supported ERP operations, data maintenance, user requests, and testing activities to ensure reliable business system performance.</w:t>
-      </w:r>
-    </w:p>
-    <w:p>
-      <w:pPr>
-        <w:spacing w:after="0"/>
-        <w:ind w:left="317" w:hanging="230"/>
-        <w:jc w:val="both"/>
-      </w:pPr>
-      <w:r>
-        <w:rPr>
-          <w:sz w:val="20"/>
-        </w:rPr>
-        <w:t>• Assisted with issue resolution, documentation, and coordination of system updates.</w:t>
-      </w:r>
-    </w:p>
-    <w:p>
-      <w:pPr>
-        <w:spacing w:before="80" w:after="0"/>
-        <w:jc w:val="both"/>
-      </w:pPr>
-      <w:r>
-        <w:rPr>
-          <w:b/>
-          <w:color w:val="366092"/>
-          <w:sz w:val="22"/>
-        </w:rPr>
-        <w:t>Computer Trainer |</w:t>
-      </w:r>
-      <w:r>
-        <w:rPr>
-          <w:b/>
-          <w:color w:val="366092"/>
-          <w:sz w:val="22"/>
-        </w:rPr>
-        <w:t xml:space="preserve"> MPPE</w:t>
-      </w:r>
-      <w:r>
-        <w:rPr>
-          <w:b/>
-          <w:color w:val="366092"/>
-          <w:sz w:val="22"/>
-        </w:rPr>
-        <w:t xml:space="preserve"> </w:t>
-      </w:r>
-      <w:r>
-        <w:rPr>
-          <w:b/>
-          <w:color w:val="366092"/>
-          <w:sz w:val="22"/>
-        </w:rPr>
-        <w:t xml:space="preserve">| </w:t>
-      </w:r>
-      <w:r>
-        <w:rPr>
-          <w:b/>
-          <w:color w:val="366092"/>
-          <w:sz w:val="22"/>
-        </w:rPr>
-        <w:t>Ministry of Education</w:t>
-      </w:r>
-      <w:r>
-        <w:rPr>
-          <w:b/>
-          <w:color w:val="366092"/>
-          <w:sz w:val="22"/>
-        </w:rPr>
-        <w:t xml:space="preserve"> </w:t>
-      </w:r>
-      <w:r>
-        <w:rPr>
-          <w:b/>
-          <w:color w:val="366092"/>
-          <w:sz w:val="22"/>
-        </w:rPr>
-        <w:t>—</w:t>
-      </w:r>
-      <w:r>
-        <w:rPr>
-          <w:i/>
-          <w:sz w:val="20"/>
-        </w:rPr>
         <w:t xml:space="preserve">    Jan 2000 – Mar 2013</w:t>
       </w:r>
     </w:p>
@@ -1592,31 +1594,7 @@
         <w:jc w:val="both"/>
       </w:pPr>
       <w:r>
-        <w:t xml:space="preserve">  • </w:t>
-      </w:r>
-      <w:r>
-        <w:t xml:space="preserve">AEC – </w:t>
-      </w:r>
-      <w:r>
-        <w:t>IT Cloud Administration</w:t>
-      </w:r>
-      <w:r>
-        <w:t xml:space="preserve"> (In Progress) – Champlain College </w:t>
-      </w:r>
-      <w:r>
-        <w:t>–</w:t>
-      </w:r>
-      <w:r>
-        <w:t xml:space="preserve"> </w:t>
-      </w:r>
-      <w:r>
-        <w:t>Saint-Lambert, Q</w:t>
-      </w:r>
-      <w:r>
-        <w:t>C</w:t>
-      </w:r>
-      <w:r>
-        <w:t>, Canada</w:t>
+        <w:t>AEC - IT Cloud Administration (Graduated Sep 2026) - Champlain College - Saint-Lambert, QC, Canada</w:t>
       </w:r>
     </w:p>
     <w:p>
@@ -1626,55 +1604,7 @@
         <w:jc w:val="both"/>
       </w:pPr>
       <w:r>
-        <w:t xml:space="preserve">• </w:t>
-      </w:r>
-      <w:r>
-        <w:t xml:space="preserve">AEC </w:t>
-      </w:r>
-      <w:r>
-        <w:t>–</w:t>
-      </w:r>
-      <w:r>
-        <w:t xml:space="preserve"> </w:t>
-      </w:r>
-      <w:r>
-        <w:t>Cybersecurity</w:t>
-      </w:r>
-      <w:r>
-        <w:t>:</w:t>
-      </w:r>
-      <w:r>
-        <w:t xml:space="preserve"> Prevention and Intervention</w:t>
-      </w:r>
-      <w:r>
-        <w:t xml:space="preserve"> </w:t>
-      </w:r>
-      <w:r>
-        <w:t>–</w:t>
-      </w:r>
-      <w:r>
-        <w:t xml:space="preserve"> </w:t>
-      </w:r>
-      <w:r>
-        <w:t xml:space="preserve">Champlain College </w:t>
-      </w:r>
-      <w:r>
-        <w:t>–</w:t>
-      </w:r>
-      <w:r>
-        <w:t xml:space="preserve"> </w:t>
-      </w:r>
-      <w:r>
-        <w:t>Saint-Lambert, Q</w:t>
-      </w:r>
-      <w:r>
-        <w:t>C</w:t>
-      </w:r>
-      <w:r>
-        <w:t>, Canada</w:t>
-      </w:r>
-      <w:r>
-        <w:t xml:space="preserve"> </w:t>
+        <w:t>AEC - Cybersecurity: Prevention and Intervention (Graduated Feb 2026) - Champlain College - Saint-Lambert, QC, Canada</w:t>
       </w:r>
     </w:p>
     <w:p>

</xml_diff>

<commit_message>
Update multilingual CVs to final 2026 format
</commit_message>
<xml_diff>
--- a/Franklyn_Vasquez_CV_EN.docx
+++ b/Franklyn_Vasquez_CV_EN.docx
@@ -4,2122 +4,713 @@
   <w:body>
     <w:p>
       <w:pPr>
-        <w:spacing w:line="240" w:lineRule="auto"/>
-        <w:jc w:val="center"/>
-        <w:rPr>
-          <w:lang w:val="fr-CA"/>
-        </w:rPr>
+        <w:pStyle w:val="CVNameX"/>
       </w:pPr>
       <w:r>
         <w:rPr>
-          <w:lang w:val="fr-CA"/>
+          <w:b w:val="0"/>
+          <w:lang w:val="en-CA"/>
         </w:rPr>
-        <w:t>Franklyn Jose Vasquez Marin</w:t>
+        <w:t>FRANKLYN JOSÉ VASQUEZ MARÍN</w:t>
       </w:r>
     </w:p>
     <w:p>
       <w:pPr>
-        <w:spacing w:line="240" w:lineRule="auto"/>
-        <w:jc w:val="center"/>
-        <w:rPr>
-          <w:lang w:val="fr-CA"/>
-        </w:rPr>
+        <w:pStyle w:val="CVContactX"/>
       </w:pPr>
       <w:r>
         <w:rPr>
-          <w:sz w:val="19"/>
-          <w:lang w:val="fr-CA"/>
+          <w:b w:val="0"/>
+          <w:lang w:val="en-CA"/>
         </w:rPr>
-        <w:t xml:space="preserve">Longueuil, Québec, </w:t>
-      </w:r>
-      <w:proofErr w:type="gramStart"/>
-      <w:r>
-        <w:rPr>
-          <w:sz w:val="19"/>
-          <w:lang w:val="fr-CA"/>
-        </w:rPr>
-        <w:t>Canada  |</w:t>
-      </w:r>
-      <w:proofErr w:type="gramEnd"/>
-      <w:r>
-        <w:rPr>
-          <w:sz w:val="19"/>
-          <w:lang w:val="fr-CA"/>
-        </w:rPr>
-        <w:t xml:space="preserve"> vasquezfu@gmail.com</w:t>
+        <w:t>Greenfield Park (Longueuil), Québec, Canada  |  vasquezfu@gmail.com</w:t>
       </w:r>
     </w:p>
     <w:p>
       <w:pPr>
-        <w:spacing w:line="240" w:lineRule="auto"/>
-        <w:jc w:val="center"/>
-        <w:rPr>
-          <w:sz w:val="18"/>
-        </w:rPr>
+        <w:pStyle w:val="CVContactX"/>
       </w:pPr>
       <w:r>
         <w:rPr>
-          <w:sz w:val="18"/>
+          <w:b w:val="0"/>
+          <w:lang w:val="en-CA"/>
         </w:rPr>
-        <w:t xml:space="preserve">LinkedIn: </w:t>
-      </w:r>
-      <w:hyperlink r:id="rId8" w:history="1">
-        <w:r>
-          <w:rPr>
-            <w:rStyle w:val="Hyperlink"/>
-            <w:color w:val="0563C1"/>
-          </w:rPr>
-          <w:t>https://www.linkedin.com/in/franklynvasquez</w:t>
-        </w:r>
-      </w:hyperlink>
-    </w:p>
-    <w:p>
-      <w:pPr>
-        <w:spacing w:line="240" w:lineRule="auto"/>
-        <w:jc w:val="center"/>
-        <w:rPr>
-          <w:sz w:val="18"/>
-        </w:rPr>
-      </w:pPr>
-      <w:r>
-        <w:rPr>
-          <w:sz w:val="18"/>
-        </w:rPr>
-        <w:t xml:space="preserve">Portfolio: </w:t>
-      </w:r>
-      <w:hyperlink r:id="rId9" w:history="1">
-        <w:r>
-          <w:rPr>
-            <w:rStyle w:val="Hyperlink"/>
-            <w:color w:val="0563C1"/>
-          </w:rPr>
-          <w:t>https://www.franklynvasquez.com</w:t>
-        </w:r>
-      </w:hyperlink>
-    </w:p>
-    <w:p>
-      <w:pPr>
-        <w:pBdr>
-          <w:bottom w:val="single" w:sz="6" w:space="1" w:color="9FBAD0"/>
-        </w:pBdr>
-        <w:spacing w:before="120" w:after="60"/>
-        <w:jc w:val="center"/>
-        <w:rPr>
-          <w:b/>
-          <w:color w:val="1F4E79"/>
-          <w:sz w:val="25"/>
-        </w:rPr>
-      </w:pPr>
-      <w:r>
-        <w:rPr>
-          <w:b/>
-          <w:color w:val="1F4E79"/>
-          <w:sz w:val="25"/>
-        </w:rPr>
-        <w:t xml:space="preserve">Systems Engineer | IT Infrastructure | Cloud Administration | Cybersecurity </w:t>
+        <w:t>linkedin.com/in/franklynvasquez  |  franklynvasquez.com</w:t>
       </w:r>
     </w:p>
     <w:p>
       <w:pPr>
-        <w:pBdr>
-          <w:bottom w:val="single" w:sz="6" w:space="1" w:color="9FBAD0"/>
-        </w:pBdr>
-        <w:spacing w:before="120" w:after="60"/>
+        <w:pStyle w:val="CVHeadlineX"/>
       </w:pPr>
       <w:r>
         <w:rPr>
-          <w:b/>
-          <w:color w:val="1F4E79"/>
+          <w:b w:val="0"/>
+          <w:lang w:val="en-CA"/>
+        </w:rPr>
+        <w:t>SYSTEMS ENGINEER  |  CLOUD &amp; IT ADMINISTRATOR  |  FULL-STACK .NET DEVELOPER</w:t>
+      </w:r>
+    </w:p>
+    <w:p>
+      <w:pPr>
+        <w:pStyle w:val="CVSectionX"/>
+        <w:pBdr>
+          <w:bottom w:val="single" w:sz="4" w:space="2" w:color="999999"/>
+        </w:pBdr>
+      </w:pPr>
+      <w:r>
+        <w:rPr>
+          <w:b w:val="0"/>
+          <w:lang w:val="en-CA"/>
         </w:rPr>
         <w:t>PROFESSIONAL SUMMARY</w:t>
       </w:r>
     </w:p>
     <w:p>
       <w:pPr>
-        <w:pBdr>
-          <w:bottom w:val="single" w:sz="6" w:space="1" w:color="9FBAD0"/>
-        </w:pBdr>
-        <w:spacing w:before="120" w:after="60"/>
-        <w:jc w:val="both"/>
+        <w:pStyle w:val="CVBodyX"/>
       </w:pPr>
       <w:r>
-        <w:t>Systems Engineer with 5+ years of experience in IT infrastructure, cloud administration, virtualization, cybersecurity, DevOps tools, and enterprise support. Experienced in Windows Server, VMware, Active Directory, GPO, Linux, cloud platforms, GitHub, Docker, Kubernetes, CI/CD, SQL, and application development. Hands-on personal projects include published Android applications, demonstrating software development, product delivery, system integration, and user-focused design. Strong background in technical documentation, troubleshooting, staff training, and IT service delivery.</w:t>
+        <w:rPr>
+          <w:b w:val="0"/>
+          <w:lang w:val="en-CA"/>
+        </w:rPr>
+        <w:t>Systems Engineer and IT professional with experience supporting Windows endpoints, enterprise applications, access management and connectivity in a data center environment. Background in C#/.NET, SQL Server, IIS and web development, complemented by cloud administration and cybersecurity training. Familiar with Microsoft Azure, AWS, Windows Server, Active Directory / Entra ID, PowerShell, virtualization and CI/CD practices. Combines infrastructure troubleshooting, software development and user support to maintain reliable business systems.</w:t>
       </w:r>
     </w:p>
     <w:p>
       <w:pPr>
+        <w:pStyle w:val="CVSectionX"/>
         <w:pBdr>
-          <w:bottom w:val="single" w:sz="6" w:space="1" w:color="9FBAD0"/>
+          <w:bottom w:val="single" w:sz="4" w:space="2" w:color="999999"/>
         </w:pBdr>
-        <w:spacing w:before="120" w:after="60"/>
+      </w:pPr>
+      <w:r>
         <w:rPr>
-          <w:b/>
-          <w:color w:val="1F4E79"/>
+          <w:b w:val="0"/>
+          <w:lang w:val="en-CA"/>
         </w:rPr>
+        <w:t>TECHNICAL SKILLS</w:t>
+      </w:r>
+    </w:p>
+    <w:p>
+      <w:pPr>
+        <w:pStyle w:val="CVSkillsX"/>
       </w:pPr>
       <w:r>
         <w:rPr>
           <w:b/>
-          <w:color w:val="1F4E79"/>
+          <w:lang w:val="en-CA"/>
         </w:rPr>
-        <w:t>CORE QUALIFICATIONS</w:t>
+        <w:t xml:space="preserve">Systems &amp; administration: </w:t>
+      </w:r>
+      <w:r>
+        <w:rPr>
+          <w:b w:val="0"/>
+          <w:lang w:val="en-CA"/>
+        </w:rPr>
+        <w:t>Windows Server 2016/2022, Windows 10/11, Active Directory, Microsoft Entra ID, Group Policy (GPO), Microsoft 365, PowerShell, IIS, VMware, Hyper-V, endpoint support.</w:t>
       </w:r>
     </w:p>
-    <w:tbl>
-      <w:tblPr>
-        <w:tblW w:w="0" w:type="auto"/>
-        <w:jc w:val="center"/>
-        <w:tblBorders>
-          <w:top w:val="single" w:sz="4" w:space="0" w:color="D9E1F2"/>
-          <w:left w:val="single" w:sz="4" w:space="0" w:color="D9E1F2"/>
-          <w:bottom w:val="single" w:sz="4" w:space="0" w:color="D9E1F2"/>
-          <w:right w:val="single" w:sz="4" w:space="0" w:color="D9E1F2"/>
-          <w:insideH w:val="single" w:sz="4" w:space="0" w:color="D9E1F2"/>
-          <w:insideV w:val="single" w:sz="4" w:space="0" w:color="D9E1F2"/>
-        </w:tblBorders>
-        <w:tblLayout w:type="fixed"/>
-        <w:tblLook w:val="04A0" w:firstRow="1" w:lastRow="0" w:firstColumn="1" w:lastColumn="0" w:noHBand="0" w:noVBand="1"/>
-      </w:tblPr>
-      <w:tblGrid>
-        <w:gridCol w:w="3175"/>
-        <w:gridCol w:w="3175"/>
-        <w:gridCol w:w="3175"/>
-      </w:tblGrid>
-      <w:tr>
-        <w:trPr>
-          <w:trHeight w:val="297"/>
-          <w:jc w:val="center"/>
-        </w:trPr>
-        <w:tc>
-          <w:tcPr>
-            <w:tcW w:w="3175" w:type="dxa"/>
-            <w:tcBorders>
-              <w:top w:val="single" w:sz="4" w:space="0" w:color="D9E1F2"/>
-              <w:left w:val="single" w:sz="4" w:space="0" w:color="D9E1F2"/>
-              <w:bottom w:val="single" w:sz="4" w:space="0" w:color="D9E1F2"/>
-              <w:right w:val="single" w:sz="4" w:space="0" w:color="D9E1F2"/>
-            </w:tcBorders>
-            <w:vAlign w:val="center"/>
-            <w:hideMark/>
-          </w:tcPr>
-          <w:p>
-            <w:r>
-              <w:t>Windows Server 2016/2022</w:t>
-            </w:r>
-          </w:p>
-        </w:tc>
-        <w:tc>
-          <w:tcPr>
-            <w:tcW w:w="3175" w:type="dxa"/>
-            <w:tcBorders>
-              <w:top w:val="single" w:sz="4" w:space="0" w:color="D9E1F2"/>
-              <w:left w:val="single" w:sz="4" w:space="0" w:color="D9E1F2"/>
-              <w:bottom w:val="single" w:sz="4" w:space="0" w:color="D9E1F2"/>
-              <w:right w:val="single" w:sz="4" w:space="0" w:color="D9E1F2"/>
-            </w:tcBorders>
-            <w:vAlign w:val="center"/>
-            <w:hideMark/>
-          </w:tcPr>
-          <w:p>
-            <w:r>
-              <w:t>Active Directory &amp; GPO</w:t>
-            </w:r>
-          </w:p>
-        </w:tc>
-        <w:tc>
-          <w:tcPr>
-            <w:tcW w:w="3175" w:type="dxa"/>
-            <w:tcBorders>
-              <w:top w:val="single" w:sz="4" w:space="0" w:color="D9E1F2"/>
-              <w:left w:val="single" w:sz="4" w:space="0" w:color="D9E1F2"/>
-              <w:bottom w:val="single" w:sz="4" w:space="0" w:color="D9E1F2"/>
-              <w:right w:val="single" w:sz="4" w:space="0" w:color="D9E1F2"/>
-            </w:tcBorders>
-            <w:vAlign w:val="center"/>
-            <w:hideMark/>
-          </w:tcPr>
-          <w:p>
-            <w:r>
-              <w:t>VMware / Virtualization</w:t>
-            </w:r>
-          </w:p>
-        </w:tc>
-      </w:tr>
-      <w:tr>
-        <w:trPr>
-          <w:trHeight w:val="501"/>
-          <w:jc w:val="center"/>
-        </w:trPr>
-        <w:tc>
-          <w:tcPr>
-            <w:tcW w:w="3175" w:type="dxa"/>
-            <w:tcBorders>
-              <w:top w:val="single" w:sz="4" w:space="0" w:color="D9E1F2"/>
-              <w:left w:val="single" w:sz="4" w:space="0" w:color="D9E1F2"/>
-              <w:bottom w:val="single" w:sz="4" w:space="0" w:color="D9E1F2"/>
-              <w:right w:val="single" w:sz="4" w:space="0" w:color="D9E1F2"/>
-            </w:tcBorders>
-            <w:vAlign w:val="center"/>
-            <w:hideMark/>
-          </w:tcPr>
-          <w:p>
-            <w:r>
-              <w:t>Cloud, DevOps &amp; GitHub</w:t>
-            </w:r>
-          </w:p>
-        </w:tc>
-        <w:tc>
-          <w:tcPr>
-            <w:tcW w:w="3175" w:type="dxa"/>
-            <w:tcBorders>
-              <w:top w:val="single" w:sz="4" w:space="0" w:color="D9E1F2"/>
-              <w:left w:val="single" w:sz="4" w:space="0" w:color="D9E1F2"/>
-              <w:bottom w:val="single" w:sz="4" w:space="0" w:color="D9E1F2"/>
-              <w:right w:val="single" w:sz="4" w:space="0" w:color="D9E1F2"/>
-            </w:tcBorders>
-            <w:vAlign w:val="center"/>
-            <w:hideMark/>
-          </w:tcPr>
-          <w:p>
-            <w:r>
-              <w:t>IT Service Delivery</w:t>
-            </w:r>
-          </w:p>
-        </w:tc>
-        <w:tc>
-          <w:tcPr>
-            <w:tcW w:w="3175" w:type="dxa"/>
-            <w:tcBorders>
-              <w:top w:val="single" w:sz="4" w:space="0" w:color="D9E1F2"/>
-              <w:left w:val="single" w:sz="4" w:space="0" w:color="D9E1F2"/>
-              <w:bottom w:val="single" w:sz="4" w:space="0" w:color="D9E1F2"/>
-              <w:right w:val="single" w:sz="4" w:space="0" w:color="D9E1F2"/>
-            </w:tcBorders>
-            <w:vAlign w:val="center"/>
-            <w:hideMark/>
-          </w:tcPr>
-          <w:p>
-            <w:r>
-              <w:t>Application Development</w:t>
-            </w:r>
-          </w:p>
-        </w:tc>
-      </w:tr>
-      <w:tr>
-        <w:trPr>
-          <w:jc w:val="center"/>
-        </w:trPr>
-        <w:tc>
-          <w:tcPr>
-            <w:tcW w:w="3175" w:type="dxa"/>
-            <w:tcBorders>
-              <w:top w:val="single" w:sz="4" w:space="0" w:color="D9E1F2"/>
-              <w:left w:val="single" w:sz="4" w:space="0" w:color="D9E1F2"/>
-              <w:bottom w:val="single" w:sz="4" w:space="0" w:color="D9E1F2"/>
-              <w:right w:val="single" w:sz="4" w:space="0" w:color="D9E1F2"/>
-            </w:tcBorders>
-            <w:hideMark/>
-          </w:tcPr>
-          <w:p>
-            <w:r>
-              <w:t>Security Hardening</w:t>
-            </w:r>
-          </w:p>
-        </w:tc>
-        <w:tc>
-          <w:tcPr>
-            <w:tcW w:w="3175" w:type="dxa"/>
-            <w:tcBorders>
-              <w:top w:val="single" w:sz="4" w:space="0" w:color="D9E1F2"/>
-              <w:left w:val="single" w:sz="4" w:space="0" w:color="D9E1F2"/>
-              <w:bottom w:val="single" w:sz="4" w:space="0" w:color="D9E1F2"/>
-              <w:right w:val="single" w:sz="4" w:space="0" w:color="D9E1F2"/>
-            </w:tcBorders>
-            <w:hideMark/>
-          </w:tcPr>
-          <w:p>
-            <w:r>
-              <w:t>System Integration</w:t>
-            </w:r>
-          </w:p>
-        </w:tc>
-        <w:tc>
-          <w:tcPr>
-            <w:tcW w:w="3175" w:type="dxa"/>
-            <w:tcBorders>
-              <w:top w:val="single" w:sz="4" w:space="0" w:color="D9E1F2"/>
-              <w:left w:val="single" w:sz="4" w:space="0" w:color="D9E1F2"/>
-              <w:bottom w:val="single" w:sz="4" w:space="0" w:color="D9E1F2"/>
-              <w:right w:val="single" w:sz="4" w:space="0" w:color="D9E1F2"/>
-            </w:tcBorders>
-            <w:hideMark/>
-          </w:tcPr>
-          <w:p>
-            <w:r>
-              <w:t>Technical Training</w:t>
-            </w:r>
-          </w:p>
-        </w:tc>
-      </w:tr>
-    </w:tbl>
     <w:p>
       <w:pPr>
-        <w:pBdr>
-          <w:bottom w:val="single" w:sz="6" w:space="1" w:color="9FBAD0"/>
-        </w:pBdr>
-        <w:spacing w:before="120" w:after="60"/>
-        <w:rPr>
-          <w:b/>
-          <w:color w:val="1F4E79"/>
-        </w:rPr>
+        <w:pStyle w:val="CVSkillsX"/>
       </w:pPr>
       <w:r>
         <w:rPr>
           <w:b/>
-          <w:color w:val="1F4E79"/>
+          <w:lang w:val="en-CA"/>
         </w:rPr>
-        <w:t>TECHNICA</w:t>
+        <w:t xml:space="preserve">Cloud &amp; DevOps: </w:t>
       </w:r>
       <w:r>
         <w:rPr>
-          <w:b/>
-          <w:color w:val="1F4E79"/>
+          <w:b w:val="0"/>
+          <w:lang w:val="en-CA"/>
         </w:rPr>
-        <w:t>L</w:t>
-      </w:r>
-      <w:r>
-        <w:rPr>
-          <w:b/>
-          <w:color w:val="1F4E79"/>
-        </w:rPr>
-        <w:t xml:space="preserve"> SKILLS</w:t>
+        <w:t>Microsoft Azure (App Service, Functions, Azure SQL, Storage, Key Vault), AWS (Lambda, API Gateway, Cognito, S3, Aurora, DynamoDB), Azure DevOps CI/CD, GitHub Actions, Docker, CloudWatch.</w:t>
       </w:r>
     </w:p>
     <w:p>
       <w:pPr>
-        <w:pBdr>
-          <w:bottom w:val="single" w:sz="6" w:space="1" w:color="9FBAD0"/>
-        </w:pBdr>
-        <w:tabs>
-          <w:tab w:val="left" w:pos="3188"/>
-        </w:tabs>
-        <w:spacing w:after="0"/>
-        <w:rPr>
-          <w:b/>
-          <w:color w:val="366092"/>
-          <w:sz w:val="22"/>
-        </w:rPr>
+        <w:pStyle w:val="CVSkillsX"/>
       </w:pPr>
       <w:r>
         <w:rPr>
           <w:b/>
-          <w:color w:val="366092"/>
-          <w:sz w:val="22"/>
+          <w:lang w:val="en-CA"/>
         </w:rPr>
-        <w:t>• Cloud Platforms:</w:t>
+        <w:t xml:space="preserve">Security, networking &amp; support: </w:t>
       </w:r>
       <w:r>
         <w:rPr>
-          <w:b/>
-          <w:color w:val="366092"/>
-          <w:sz w:val="22"/>
+          <w:b w:val="0"/>
+          <w:lang w:val="en-CA"/>
         </w:rPr>
-        <w:tab/>
+        <w:t>KACE SDA/SMA, PXE deployment, ESET Protect/FDE, identity and access troubleshooting, TCP/IP networking, application support, patching, software validation and technical documentation.</w:t>
       </w:r>
     </w:p>
     <w:p>
       <w:pPr>
-        <w:pBdr>
-          <w:bottom w:val="single" w:sz="6" w:space="1" w:color="9FBAD0"/>
-        </w:pBdr>
-        <w:spacing w:after="0"/>
+        <w:pStyle w:val="CVSkillsX"/>
       </w:pPr>
       <w:r>
-        <w:t>AWS (EC2, IAM, VPC, Security Groups), Microsoft Azure (VMs, Networking), Google Cloud Platform</w:t>
+        <w:rPr>
+          <w:b/>
+          <w:lang w:val="en-CA"/>
+        </w:rPr>
+        <w:t xml:space="preserve">Software &amp; databases: </w:t>
       </w:r>
       <w:r>
-        <w:t>.</w:t>
+        <w:rPr>
+          <w:b w:val="0"/>
+          <w:lang w:val="en-CA"/>
+        </w:rPr>
+        <w:t>C#, ASP.NET, .NET Core, REST APIs, SQL Server, T-SQL, MySQL, PostgreSQL, Node.js, OAuth, Git/GitHub.</w:t>
       </w:r>
     </w:p>
     <w:p>
       <w:pPr>
-        <w:pBdr>
-          <w:bottom w:val="single" w:sz="6" w:space="1" w:color="9FBAD0"/>
-        </w:pBdr>
-        <w:spacing w:after="0"/>
-        <w:rPr>
-          <w:b/>
-          <w:color w:val="366092"/>
-          <w:sz w:val="22"/>
-        </w:rPr>
+        <w:pStyle w:val="CVSkillsX"/>
       </w:pPr>
       <w:r>
         <w:rPr>
           <w:b/>
-          <w:color w:val="366092"/>
-          <w:sz w:val="22"/>
+          <w:lang w:val="en-CA"/>
         </w:rPr>
-        <w:t>• DevOps &amp; Tools:</w:t>
+        <w:t xml:space="preserve">Web technologies: </w:t>
+      </w:r>
+      <w:r>
+        <w:rPr>
+          <w:b w:val="0"/>
+          <w:lang w:val="en-CA"/>
+        </w:rPr>
+        <w:t>React, Next.js, TypeScript, JavaScript, HTML5, CSS3, Tailwind CSS, responsive UI, form validation.</w:t>
       </w:r>
     </w:p>
     <w:p>
       <w:pPr>
+        <w:pStyle w:val="CVSectionX"/>
         <w:pBdr>
-          <w:bottom w:val="single" w:sz="6" w:space="1" w:color="9FBAD0"/>
+          <w:bottom w:val="single" w:sz="4" w:space="2" w:color="999999"/>
         </w:pBdr>
-        <w:spacing w:after="0"/>
-      </w:pPr>
-      <w:r>
-        <w:t>Docker, Kubernetes, Jenkins, Ansible, Git, GitHub, CI/CD pipelines.</w:t>
-      </w:r>
-    </w:p>
-    <w:p>
-      <w:pPr>
-        <w:keepNext/>
-        <w:pBdr>
-          <w:bottom w:val="single" w:sz="6" w:space="1" w:color="9FBAD0"/>
-        </w:pBdr>
-        <w:spacing w:after="0"/>
-        <w:rPr>
-          <w:b/>
-          <w:color w:val="366092"/>
-          <w:sz w:val="22"/>
-        </w:rPr>
       </w:pPr>
       <w:r>
         <w:rPr>
-          <w:b/>
-          <w:color w:val="366092"/>
-          <w:sz w:val="22"/>
-        </w:rPr>
-        <w:t>• Data &amp; Reporting:</w:t>
-      </w:r>
-    </w:p>
-    <w:p>
-      <w:pPr>
-        <w:pBdr>
-          <w:bottom w:val="single" w:sz="6" w:space="1" w:color="9FBAD0"/>
-        </w:pBdr>
-        <w:spacing w:after="0"/>
-      </w:pPr>
-      <w:r>
-        <w:t>Power BI coursework, dashboards, data visualization, data processing, and SQL reporting.</w:t>
-      </w:r>
-    </w:p>
-    <w:p>
-      <w:pPr>
-        <w:pBdr>
-          <w:bottom w:val="single" w:sz="6" w:space="1" w:color="9FBAD0"/>
-        </w:pBdr>
-        <w:spacing w:after="0"/>
-        <w:rPr>
-          <w:b/>
-          <w:color w:val="366092"/>
-          <w:sz w:val="22"/>
-        </w:rPr>
-      </w:pPr>
-      <w:r>
-        <w:rPr>
-          <w:b/>
-          <w:color w:val="366092"/>
-          <w:sz w:val="22"/>
-        </w:rPr>
-        <w:t>• Operating Systems:</w:t>
-      </w:r>
-    </w:p>
-    <w:p>
-      <w:pPr>
-        <w:pBdr>
-          <w:bottom w:val="single" w:sz="6" w:space="1" w:color="9FBAD0"/>
-        </w:pBdr>
-        <w:spacing w:after="0"/>
-      </w:pPr>
-      <w:r>
-        <w:t>Linux (Ubuntu, CentOS), Windows Server, Windows Desktop Support</w:t>
-      </w:r>
-      <w:r>
-        <w:t>.</w:t>
-      </w:r>
-    </w:p>
-    <w:p>
-      <w:pPr>
-        <w:pBdr>
-          <w:bottom w:val="single" w:sz="6" w:space="1" w:color="9FBAD0"/>
-        </w:pBdr>
-        <w:spacing w:after="0"/>
-        <w:rPr>
-          <w:b/>
-          <w:color w:val="366092"/>
-          <w:sz w:val="22"/>
-        </w:rPr>
-      </w:pPr>
-      <w:r>
-        <w:rPr>
-          <w:b/>
-          <w:color w:val="366092"/>
-          <w:sz w:val="22"/>
-        </w:rPr>
-        <w:t>• Networking &amp; Infrastructure:</w:t>
-      </w:r>
-    </w:p>
-    <w:p>
-      <w:pPr>
-        <w:pBdr>
-          <w:bottom w:val="single" w:sz="6" w:space="1" w:color="9FBAD0"/>
-        </w:pBdr>
-        <w:spacing w:after="0"/>
-      </w:pPr>
-      <w:r>
-        <w:t>TCP/IP, DNS, DHCP, Subnetting, SSH, NAT, Virtualization Technologies</w:t>
-      </w:r>
-      <w:r>
-        <w:t>.</w:t>
-      </w:r>
-    </w:p>
-    <w:p>
-      <w:pPr>
-        <w:pBdr>
-          <w:bottom w:val="single" w:sz="6" w:space="1" w:color="9FBAD0"/>
-        </w:pBdr>
-        <w:spacing w:after="0"/>
-      </w:pPr>
-      <w:r>
-        <w:t xml:space="preserve">• </w:t>
-      </w:r>
-      <w:r>
-        <w:rPr>
-          <w:b/>
-          <w:color w:val="366092"/>
-          <w:sz w:val="22"/>
-        </w:rPr>
-        <w:t>Programming &amp; Scripting</w:t>
-      </w:r>
-      <w:r>
-        <w:rPr>
-          <w:b/>
-          <w:color w:val="366092"/>
-          <w:sz w:val="22"/>
-        </w:rPr>
-        <w:t xml:space="preserve"> &amp; DB</w:t>
-      </w:r>
-      <w:r>
-        <w:rPr>
-          <w:b/>
-          <w:color w:val="366092"/>
-          <w:sz w:val="22"/>
-        </w:rPr>
-        <w:t>:</w:t>
-      </w:r>
-    </w:p>
-    <w:p>
-      <w:pPr>
-        <w:pBdr>
-          <w:bottom w:val="single" w:sz="6" w:space="1" w:color="9FBAD0"/>
-        </w:pBdr>
-        <w:spacing w:after="0"/>
-      </w:pPr>
-      <w:r>
-        <w:t>Python</w:t>
-      </w:r>
-      <w:r>
-        <w:t xml:space="preserve"> </w:t>
-      </w:r>
-      <w:r>
-        <w:t>(basic),</w:t>
-      </w:r>
-      <w:r>
-        <w:t xml:space="preserve"> PHP, VBA, </w:t>
-      </w:r>
-      <w:r>
-        <w:t>Microsoft</w:t>
-      </w:r>
-      <w:r>
-        <w:t xml:space="preserve"> Visual Basic, </w:t>
-      </w:r>
-      <w:r>
-        <w:t>Microsoft Visual C++</w:t>
-      </w:r>
-      <w:r>
-        <w:t>,</w:t>
-      </w:r>
-      <w:r>
-        <w:t xml:space="preserve"> </w:t>
-      </w:r>
-      <w:r>
-        <w:t xml:space="preserve">Flutter, </w:t>
-      </w:r>
-      <w:r>
-        <w:t>Bash scripting</w:t>
-      </w:r>
-      <w:r>
-        <w:t>, SQL, PostgreSQL</w:t>
-      </w:r>
-      <w:r>
-        <w:t>.</w:t>
-      </w:r>
-    </w:p>
-    <w:p>
-      <w:pPr>
-        <w:pBdr>
-          <w:bottom w:val="single" w:sz="6" w:space="1" w:color="9FBAD0"/>
-        </w:pBdr>
-        <w:spacing w:after="0"/>
-        <w:rPr>
-          <w:b/>
-          <w:color w:val="366092"/>
-          <w:sz w:val="22"/>
-        </w:rPr>
-      </w:pPr>
-      <w:r>
-        <w:rPr>
-          <w:b/>
-          <w:color w:val="366092"/>
-          <w:sz w:val="22"/>
-        </w:rPr>
-        <w:t>• Monitoring &amp; Logging:</w:t>
-      </w:r>
-    </w:p>
-    <w:p>
-      <w:pPr>
-        <w:pBdr>
-          <w:bottom w:val="single" w:sz="6" w:space="1" w:color="9FBAD0"/>
-        </w:pBdr>
-        <w:spacing w:after="0"/>
-      </w:pPr>
-      <w:r>
-        <w:t>System monitoring, troubleshooting, and log analysis</w:t>
-      </w:r>
-      <w:r>
-        <w:t>.</w:t>
-      </w:r>
-    </w:p>
-    <w:p>
-      <w:pPr>
-        <w:pBdr>
-          <w:bottom w:val="single" w:sz="6" w:space="1" w:color="9FBAD0"/>
-        </w:pBdr>
-        <w:spacing w:after="0"/>
-        <w:rPr>
-          <w:b/>
-          <w:color w:val="366092"/>
-          <w:sz w:val="22"/>
-        </w:rPr>
-      </w:pPr>
-      <w:r>
-        <w:rPr>
-          <w:b/>
-          <w:color w:val="366092"/>
-          <w:sz w:val="22"/>
-        </w:rPr>
-        <w:t xml:space="preserve">• </w:t>
-      </w:r>
-      <w:r>
-        <w:rPr>
-          <w:b/>
-          <w:color w:val="366092"/>
-          <w:sz w:val="22"/>
-        </w:rPr>
-        <w:t>C</w:t>
-      </w:r>
-      <w:r>
-        <w:rPr>
-          <w:b/>
-          <w:color w:val="366092"/>
-          <w:sz w:val="22"/>
-        </w:rPr>
-        <w:t>ybersecurity</w:t>
-      </w:r>
-      <w:r>
-        <w:rPr>
-          <w:b/>
-          <w:color w:val="366092"/>
-          <w:sz w:val="22"/>
-        </w:rPr>
-        <w:t>:</w:t>
-      </w:r>
-    </w:p>
-    <w:p>
-      <w:pPr>
-        <w:pBdr>
-          <w:bottom w:val="single" w:sz="6" w:space="1" w:color="9FBAD0"/>
-        </w:pBdr>
-        <w:spacing w:after="0"/>
-      </w:pPr>
-      <w:r>
-        <w:t>Wireshark</w:t>
-      </w:r>
-      <w:r>
-        <w:t xml:space="preserve">, </w:t>
-      </w:r>
-      <w:r>
-        <w:t>Nmap</w:t>
-      </w:r>
-      <w:r>
-        <w:t xml:space="preserve">, </w:t>
-      </w:r>
-      <w:r>
-        <w:t>Linux / Kali Linux</w:t>
-      </w:r>
-      <w:r>
-        <w:t xml:space="preserve">, </w:t>
-      </w:r>
-      <w:proofErr w:type="spellStart"/>
-      <w:r>
-        <w:t>Wazuh</w:t>
-      </w:r>
-      <w:proofErr w:type="spellEnd"/>
-      <w:r>
-        <w:t xml:space="preserve">, </w:t>
-      </w:r>
-      <w:r>
-        <w:t>Suricata</w:t>
-      </w:r>
-      <w:r>
-        <w:t xml:space="preserve">, </w:t>
-      </w:r>
-      <w:r>
-        <w:t>Nessus</w:t>
-      </w:r>
-      <w:r>
-        <w:t xml:space="preserve">, </w:t>
-      </w:r>
-      <w:r>
-        <w:t>OpenVAS</w:t>
-      </w:r>
-      <w:r>
-        <w:t xml:space="preserve">. </w:t>
-      </w:r>
-      <w:r>
-        <w:t>Splunk</w:t>
-      </w:r>
-      <w:r>
-        <w:t xml:space="preserve">, </w:t>
-      </w:r>
-      <w:r>
-        <w:t>Autopsy</w:t>
-      </w:r>
-      <w:r>
-        <w:t xml:space="preserve"> and </w:t>
-      </w:r>
-      <w:r>
-        <w:t>Burp Suite</w:t>
-      </w:r>
-      <w:r>
-        <w:t>.</w:t>
-      </w:r>
-    </w:p>
-    <w:p>
-      <w:pPr>
-        <w:pBdr>
-          <w:bottom w:val="single" w:sz="6" w:space="1" w:color="9FBAD0"/>
-        </w:pBdr>
-        <w:spacing w:after="0"/>
-        <w:rPr>
-          <w:sz w:val="6"/>
-          <w:szCs w:val="6"/>
-        </w:rPr>
-      </w:pPr>
-    </w:p>
-    <w:p>
-      <w:pPr>
-        <w:pBdr>
-          <w:bottom w:val="single" w:sz="6" w:space="1" w:color="9FBAD0"/>
-        </w:pBdr>
-        <w:spacing w:before="120" w:after="60"/>
-      </w:pPr>
-      <w:r>
-        <w:rPr>
-          <w:b/>
-          <w:color w:val="366092"/>
-          <w:sz w:val="22"/>
-        </w:rPr>
-        <w:t>RECENT</w:t>
-      </w:r>
-      <w:r>
-        <w:rPr>
-          <w:b/>
-          <w:color w:val="366092"/>
-          <w:sz w:val="22"/>
-        </w:rPr>
-        <w:t xml:space="preserve"> </w:t>
-      </w:r>
-      <w:r>
-        <w:rPr>
-          <w:b/>
-          <w:color w:val="366092"/>
-          <w:sz w:val="22"/>
-        </w:rPr>
-        <w:t>PERSONAL PROJECT</w:t>
-      </w:r>
-    </w:p>
-    <w:p>
-      <w:pPr>
-        <w:keepNext/>
-        <w:spacing w:before="80" w:after="0"/>
-        <w:rPr>
-          <w:i/>
-          <w:sz w:val="20"/>
-        </w:rPr>
-      </w:pPr>
-      <w:proofErr w:type="spellStart"/>
-      <w:r>
-        <w:rPr>
-          <w:b/>
-          <w:color w:val="366092"/>
-          <w:sz w:val="22"/>
-        </w:rPr>
-        <w:lastRenderedPageBreak/>
-        <w:t>FlashCards</w:t>
-      </w:r>
-      <w:proofErr w:type="spellEnd"/>
-      <w:r>
-        <w:rPr>
-          <w:b/>
-          <w:color w:val="366092"/>
-          <w:sz w:val="22"/>
-        </w:rPr>
-        <w:t xml:space="preserve">: Learn English </w:t>
-      </w:r>
-      <w:r>
-        <w:rPr>
-          <w:b/>
-          <w:color w:val="366092"/>
-          <w:sz w:val="22"/>
-        </w:rPr>
-        <w:t>-</w:t>
-      </w:r>
-      <w:r>
-        <w:rPr>
-          <w:b/>
-          <w:color w:val="366092"/>
-          <w:sz w:val="22"/>
-        </w:rPr>
-        <w:t xml:space="preserve"> Published Android Application</w:t>
-      </w:r>
-      <w:r>
-        <w:rPr>
-          <w:b/>
-          <w:color w:val="366092"/>
-          <w:sz w:val="22"/>
-        </w:rPr>
-        <w:t xml:space="preserve"> | Personal Project</w:t>
-      </w:r>
-    </w:p>
-    <w:p>
-      <w:pPr>
-        <w:numPr>
-          <w:ilvl w:val="0"/>
-          <w:numId w:val="11"/>
-        </w:numPr>
-        <w:spacing w:before="80" w:after="0"/>
-      </w:pPr>
-      <w:r>
-        <w:t>Designed, developed, and published an Android language-learning application on Google Play, demonstrating mobile development, product delivery, user-focused design, and app deployment workflows.</w:t>
-      </w:r>
-    </w:p>
-    <w:p>
-      <w:pPr>
-        <w:numPr>
-          <w:ilvl w:val="0"/>
-          <w:numId w:val="11"/>
-        </w:numPr>
-        <w:spacing w:before="80" w:after="0"/>
-      </w:pPr>
-      <w:r>
-        <w:t>Implemented learning features such as flashcards, pronunciation/listening practice, speaking practice concepts, user authentication, and structured study screens.</w:t>
-      </w:r>
-    </w:p>
-    <w:p>
-      <w:pPr>
-        <w:numPr>
-          <w:ilvl w:val="0"/>
-          <w:numId w:val="11"/>
-        </w:numPr>
-        <w:spacing w:before="80" w:after="0"/>
-      </w:pPr>
-      <w:r>
-        <w:t xml:space="preserve">Google Play: </w:t>
-      </w:r>
-      <w:hyperlink r:id="rId11" w:history="1">
-        <w:r>
-          <w:rPr>
-            <w:rStyle w:val="Hyperlink"/>
-            <w:color w:val="0563C1"/>
-          </w:rPr>
-          <w:t>https://play.google.com/store/apps/details?id=com.flashcards.puffin</w:t>
-        </w:r>
-      </w:hyperlink>
-    </w:p>
-    <w:p>
-      <w:pPr>
-        <w:keepNext/>
-        <w:spacing w:before="80" w:after="0"/>
-        <w:rPr>
-          <w:b/>
-          <w:color w:val="366092"/>
-          <w:sz w:val="22"/>
-        </w:rPr>
-      </w:pPr>
-      <w:r>
-        <w:rPr>
-          <w:b/>
-          <w:color w:val="366092"/>
-        </w:rPr>
-        <w:t>Daily Agenda | Android Application | Personal Project</w:t>
-      </w:r>
-    </w:p>
-    <w:p>
-      <w:pPr>
-        <w:numPr>
-          <w:ilvl w:val="0"/>
-          <w:numId w:val="10"/>
-        </w:numPr>
-        <w:spacing w:before="80" w:after="0"/>
-        <w:rPr>
-          <w:rStyle w:val="Hyperlink"/>
-          <w:color w:val="0563C1"/>
-        </w:rPr>
-      </w:pPr>
-      <w:r>
-        <w:t>Published a daily planning Android app focused on agenda organization, reminders, and task management.</w:t>
-      </w:r>
-      <w:r>
-        <w:br/>
-        <w:t xml:space="preserve">Google Play: </w:t>
-      </w:r>
-      <w:hyperlink r:id="rId12">
-        <w:r>
-          <w:rPr>
-            <w:rStyle w:val="Hyperlink"/>
-            <w:color w:val="0563C1"/>
-          </w:rPr>
-          <w:t>https://play.google.com/store/apps/details?id=com.dailyagenda.dailyagenda</w:t>
-        </w:r>
-      </w:hyperlink>
-    </w:p>
-    <w:p>
-      <w:pPr>
-        <w:spacing w:after="0"/>
-        <w:rPr>
-          <w:b/>
-          <w:color w:val="366092"/>
-          <w:sz w:val="22"/>
-        </w:rPr>
-      </w:pPr>
-      <w:r>
-        <w:rPr>
-          <w:b/>
-          <w:color w:val="366092"/>
-        </w:rPr>
-        <w:t>Key Vault | Android Application | Personal Project</w:t>
-      </w:r>
-    </w:p>
-    <w:p>
-      <w:pPr>
-        <w:numPr>
-          <w:ilvl w:val="0"/>
-          <w:numId w:val="10"/>
-        </w:numPr>
-        <w:spacing w:before="80" w:after="0"/>
-      </w:pPr>
-      <w:r>
-        <w:t>Published an Android application focused on storing and organizing sensitive user information.</w:t>
-      </w:r>
-      <w:r>
-        <w:br/>
-        <w:t xml:space="preserve">Google Play: </w:t>
-      </w:r>
-      <w:hyperlink r:id="rId13">
-        <w:r>
-          <w:rPr>
-            <w:rStyle w:val="Hyperlink"/>
-            <w:color w:val="0563C1"/>
-          </w:rPr>
-          <w:t>https://play.google.com/store/apps/details?id=com.keyvault.vault</w:t>
-        </w:r>
-      </w:hyperlink>
-    </w:p>
-    <w:p>
-      <w:pPr>
-        <w:pBdr>
-          <w:bottom w:val="single" w:sz="6" w:space="1" w:color="9FBAD0"/>
-        </w:pBdr>
-        <w:spacing w:before="120" w:after="60"/>
-        <w:rPr>
-          <w:b/>
-          <w:color w:val="1F4E79"/>
-          <w:sz w:val="6"/>
-          <w:szCs w:val="6"/>
-        </w:rPr>
-      </w:pPr>
-    </w:p>
-    <w:p>
-      <w:pPr>
-        <w:pBdr>
-          <w:bottom w:val="single" w:sz="6" w:space="1" w:color="9FBAD0"/>
-        </w:pBdr>
-        <w:spacing w:before="120" w:after="60"/>
-      </w:pPr>
-      <w:r>
-        <w:rPr>
-          <w:b/>
-          <w:color w:val="1F4E79"/>
+          <w:b w:val="0"/>
+          <w:lang w:val="en-CA"/>
         </w:rPr>
         <w:t>PROFESSIONAL EXPERIENCE</w:t>
       </w:r>
     </w:p>
     <w:p>
       <w:pPr>
-        <w:keepNext/>
-        <w:spacing w:before="80" w:after="0"/>
+        <w:pStyle w:val="CVJobX"/>
+      </w:pPr>
+      <w:r>
         <w:rPr>
-          <w:i/>
-          <w:sz w:val="20"/>
+          <w:b w:val="0"/>
+          <w:lang w:val="en-CA"/>
+        </w:rPr>
+        <w:t>IT Support Intern  |  eStruxture Data Centers  |  Montréal, QC  |  Jul 2026 – Sep 2026</w:t>
+      </w:r>
+    </w:p>
+    <w:p>
+      <w:pPr>
+        <w:pStyle w:val="CVBulletX"/>
+      </w:pPr>
+      <w:r>
+        <w:rPr>
+          <w:b w:val="0"/>
+          <w:lang w:val="en-CA"/>
+        </w:rPr>
+        <w:t>•  Troubleshot Windows endpoints, application errors, user permissions, identity/access issues and connectivity in a production data center IT environment supporting an inventory of approximately 550 PCs.</w:t>
+      </w:r>
+    </w:p>
+    <w:p>
+      <w:pPr>
+        <w:pStyle w:val="CVBulletX"/>
+      </w:pPr>
+      <w:r>
+        <w:rPr>
+          <w:b w:val="0"/>
+          <w:lang w:val="en-CA"/>
+        </w:rPr>
+        <w:t>•  Supported KACE SDA/SMA and PXE-based endpoint deployment, software updates, ESET Protect/FDE endpoint security and application validation.</w:t>
+      </w:r>
+    </w:p>
+    <w:p>
+      <w:pPr>
+        <w:pStyle w:val="CVBulletX"/>
+      </w:pPr>
+      <w:r>
+        <w:rPr>
+          <w:b w:val="0"/>
+          <w:lang w:val="en-CA"/>
+        </w:rPr>
+        <w:t>•  Configured 8x8 Work on 20 PCs and helped standardize software installation, verification and troubleshooting procedures.</w:t>
+      </w:r>
+    </w:p>
+    <w:p>
+      <w:pPr>
+        <w:pStyle w:val="CVBulletX"/>
+      </w:pPr>
+      <w:r>
+        <w:rPr>
+          <w:b w:val="0"/>
+          <w:lang w:val="en-CA"/>
+        </w:rPr>
+        <w:t>•  Assisted with enterprise tools and access workflows, documenting resolutions and escalating infrastructure issues as needed.</w:t>
+      </w:r>
+    </w:p>
+    <w:p>
+      <w:pPr>
+        <w:pStyle w:val="CVJobX"/>
+      </w:pPr>
+      <w:r>
+        <w:rPr>
+          <w:b w:val="0"/>
+          <w:lang w:val="en-CA"/>
+        </w:rPr>
+        <w:t>Professional Development &amp; Technical Training  |  Saint-Lambert, QC  |  Nov 2024 – Jun 2026</w:t>
+      </w:r>
+    </w:p>
+    <w:p>
+      <w:pPr>
+        <w:pStyle w:val="CVBulletX"/>
+      </w:pPr>
+      <w:r>
+        <w:rPr>
+          <w:b w:val="0"/>
+          <w:lang w:val="en-CA"/>
+        </w:rPr>
+        <w:t>•  Completed studies in Cybersecurity: Prevention and Intervention (qualification awarded Feb 2026) and IT Cloud Administration (qualification awarded Sep 2026) at Champlain College.</w:t>
+      </w:r>
+    </w:p>
+    <w:p>
+      <w:pPr>
+        <w:pStyle w:val="CVJobX"/>
+      </w:pPr>
+      <w:r>
+        <w:rPr>
+          <w:b w:val="0"/>
+          <w:lang w:val="en-CA"/>
+        </w:rPr>
+        <w:t>Freelance Information Technology Consultant  |  Self-Employed  |  Longueuil, QC  |  Apr 2019 – Sep 2024</w:t>
+      </w:r>
+    </w:p>
+    <w:p>
+      <w:pPr>
+        <w:pStyle w:val="CVBulletX"/>
+      </w:pPr>
+      <w:r>
+        <w:rPr>
+          <w:b w:val="0"/>
+          <w:lang w:val="en-CA"/>
+        </w:rPr>
+        <w:t>•  Developed, maintained and supported business applications using C#/.NET, SQL Server and REST APIs, improving existing functionality for operational workflows.</w:t>
+      </w:r>
+    </w:p>
+    <w:p>
+      <w:pPr>
+        <w:pStyle w:val="CVBulletX"/>
+      </w:pPr>
+      <w:r>
+        <w:rPr>
+          <w:b w:val="0"/>
+          <w:lang w:val="en-CA"/>
+        </w:rPr>
+        <w:t>•  Diagnosed and resolved application, database, authentication, web-server and deployment issues across front-end and back-end components.</w:t>
+      </w:r>
+    </w:p>
+    <w:p>
+      <w:pPr>
+        <w:pStyle w:val="CVBulletX"/>
+      </w:pPr>
+      <w:r>
+        <w:rPr>
+          <w:b w:val="0"/>
+          <w:lang w:val="en-CA"/>
+        </w:rPr>
+        <w:t>•  Provided functional testing, user support and technical documentation; worked with IIS-hosted applications and database environments.</w:t>
+      </w:r>
+    </w:p>
+    <w:p>
+      <w:pPr>
+        <w:pStyle w:val="CVJobX"/>
+      </w:pPr>
+      <w:r>
+        <w:rPr>
+          <w:b w:val="0"/>
+          <w:lang w:val="en-CA"/>
+        </w:rPr>
+        <w:t>Process Engineer  |  PDVSA, Petroleum Refinery  |  Puerto La Cruz, Venezuela  |  May 2014 – Mar 2019</w:t>
+      </w:r>
+    </w:p>
+    <w:p>
+      <w:pPr>
+        <w:pStyle w:val="CVBulletX"/>
+      </w:pPr>
+      <w:r>
+        <w:rPr>
+          <w:b w:val="0"/>
+          <w:lang w:val="en-CA"/>
+        </w:rPr>
+        <w:t>•  Collaborated with operational and technical teams on process improvements, reporting requirements and documentation of business workflows.</w:t>
+      </w:r>
+    </w:p>
+    <w:p>
+      <w:pPr>
+        <w:pStyle w:val="CVJobX"/>
+        <w:rPr>
+          <w:lang w:val="es-VE"/>
         </w:rPr>
       </w:pPr>
       <w:r>
         <w:rPr>
-          <w:b/>
-          <w:color w:val="366092"/>
-          <w:sz w:val="22"/>
+          <w:b w:val="0"/>
+          <w:lang w:val="en-CA"/>
         </w:rPr>
-        <w:t>Technical Support Intern | eStruxture Data Centers</w:t>
-      </w:r>
-      <w:r>
-        <w:rPr>
-          <w:b/>
-          <w:color w:val="366092"/>
-          <w:sz w:val="22"/>
-        </w:rPr>
-        <w:t xml:space="preserve">  •  </w:t>
-      </w:r>
-      <w:r>
-        <w:rPr>
-          <w:i/>
-          <w:sz w:val="20"/>
-        </w:rPr>
-        <w:t>Jul 2026 - Sep 2026</w:t>
+        <w:t>ERP Analyst  |  PDVSA, Petroleum Refinery  |  Puerto La Cruz, Venezuela  |  Mar 2013 – May 2014</w:t>
       </w:r>
     </w:p>
     <w:p>
       <w:pPr>
-        <w:keepNext/>
-        <w:spacing w:before="80" w:after="0"/>
+        <w:pStyle w:val="CVBulletX"/>
       </w:pPr>
       <w:r>
-        <w:t>Internship - Montreal, Quebec, Canada - On-site</w:t>
+        <w:rPr>
+          <w:b w:val="0"/>
+          <w:lang w:val="en-CA"/>
+        </w:rPr>
+        <w:t>•  Supported ERP end users, incident resolution, functional testing and business reporting with technology and operations teams.</w:t>
       </w:r>
     </w:p>
     <w:p>
       <w:pPr>
-        <w:numPr>
-          <w:ilvl w:val="0"/>
-          <w:numId w:val="10"/>
-        </w:numPr>
-        <w:spacing w:before="80" w:after="0"/>
+        <w:pStyle w:val="CVSectionX"/>
+        <w:pBdr>
+          <w:bottom w:val="single" w:sz="4" w:space="2" w:color="999999"/>
+        </w:pBdr>
       </w:pPr>
       <w:r>
-        <w:t>Provided hands-on IT support in a data center environment, troubleshooting Windows laptops, software, hardware, printers, and user access issues.</w:t>
+        <w:rPr>
+          <w:b w:val="0"/>
+          <w:lang w:val="en-CA"/>
+        </w:rPr>
+        <w:t>SELECTED SOFTWARE &amp; CLOUD PROJECTS</w:t>
       </w:r>
     </w:p>
     <w:p>
       <w:pPr>
-        <w:numPr>
-          <w:ilvl w:val="0"/>
-          <w:numId w:val="10"/>
-        </w:numPr>
-        <w:spacing w:before="80" w:after="0"/>
+        <w:pStyle w:val="CVProjectX"/>
       </w:pPr>
       <w:r>
-        <w:t>Deployed and configured Windows laptops, installed corporate applications, and prepared devices for new and existing employees.</w:t>
+        <w:rPr>
+          <w:b w:val="0"/>
+          <w:lang w:val="en-CA"/>
+        </w:rPr>
+        <w:t>GiveSwap  |  Full-Stack Marketplace  |  giveswap.com</w:t>
       </w:r>
     </w:p>
     <w:p>
       <w:pPr>
-        <w:numPr>
-          <w:ilvl w:val="0"/>
-          <w:numId w:val="10"/>
-        </w:numPr>
-        <w:spacing w:before="80" w:after="0"/>
+        <w:pStyle w:val="CVBulletX"/>
       </w:pPr>
       <w:r>
-        <w:t>Used KACE for software deployment, inventory management, scripting, system maintenance, and troubleshooting.</w:t>
+        <w:rPr>
+          <w:b w:val="0"/>
+          <w:lang w:val="en-CA"/>
+        </w:rPr>
+        <w:t>•  Developed a React/Next.js and TypeScript marketplace with Node.js and REST APIs; integrated AWS Cognito, Aurora PostgreSQL, DynamoDB and S3 for authentication, data and storage, with Git/GitHub and CloudWatch for release testing.</w:t>
       </w:r>
     </w:p>
     <w:p>
       <w:pPr>
-        <w:numPr>
-          <w:ilvl w:val="0"/>
-          <w:numId w:val="10"/>
-        </w:numPr>
-        <w:spacing w:before="80" w:after="0"/>
+        <w:pStyle w:val="CVProjectX"/>
+        <w:rPr>
+          <w:lang w:val="es-VE"/>
+        </w:rPr>
       </w:pPr>
       <w:r>
-        <w:t>Supported endpoint security operations using ESET Protect, ESET Full Disk Encryption, BitLocker, and security policies.</w:t>
+        <w:rPr>
+          <w:b w:val="0"/>
+          <w:lang w:val="en-CA"/>
+        </w:rPr>
+        <w:t>Drones Latinoamérica  |  Bilingual Content Platform  |  drones-latinoamerica.com</w:t>
       </w:r>
     </w:p>
     <w:p>
       <w:pPr>
-        <w:numPr>
-          <w:ilvl w:val="0"/>
-          <w:numId w:val="10"/>
-        </w:numPr>
-        <w:spacing w:before="80" w:after="0"/>
+        <w:pStyle w:val="CVBulletX"/>
       </w:pPr>
       <w:r>
-        <w:t>Assisted with application deployment and troubleshooting for Avigilon, CCure, BioConnect, 8x8 Work, and other enterprise applications.</w:t>
+        <w:rPr>
+          <w:b w:val="0"/>
+          <w:lang w:val="en-CA"/>
+        </w:rPr>
+        <w:t>•  Created and maintained a two-language technical content website with categorized resources and responsive navigation.</w:t>
       </w:r>
     </w:p>
     <w:p>
       <w:pPr>
-        <w:numPr>
-          <w:ilvl w:val="0"/>
-          <w:numId w:val="10"/>
-        </w:numPr>
-        <w:spacing w:before="80" w:after="0"/>
+        <w:pStyle w:val="CVProjectX"/>
       </w:pPr>
       <w:r>
-        <w:t>Performed software and hardware inventory reviews, identified unsupported applications, and assisted with remediation activities.</w:t>
+        <w:rPr>
+          <w:b w:val="0"/>
+          <w:lang w:val="en-CA"/>
+        </w:rPr>
+        <w:t>SysSign Inspector Pro &amp; ClearZonePC  |  Windows Utilities</w:t>
       </w:r>
     </w:p>
     <w:p>
       <w:pPr>
-        <w:spacing w:before="80" w:after="0"/>
+        <w:pStyle w:val="CVBulletX"/>
+      </w:pPr>
+      <w:r>
         <w:rPr>
-          <w:i/>
-          <w:sz w:val="20"/>
+          <w:b w:val="0"/>
+          <w:lang w:val="en-CA"/>
         </w:rPr>
+        <w:t>•  Developed two utilities for Windows security and maintenance, including process inspection, signature checks, storage review and software management.</w:t>
+      </w:r>
+    </w:p>
+    <w:p>
+      <w:pPr>
+        <w:pStyle w:val="CVSectionX"/>
+        <w:pBdr>
+          <w:bottom w:val="single" w:sz="4" w:space="2" w:color="999999"/>
+        </w:pBdr>
+      </w:pPr>
+      <w:r>
+        <w:rPr>
+          <w:b w:val="0"/>
+          <w:lang w:val="en-CA"/>
+        </w:rPr>
+        <w:t>EDUCATION</w:t>
+      </w:r>
+    </w:p>
+    <w:p>
+      <w:pPr>
+        <w:pStyle w:val="CVEduX"/>
       </w:pPr>
       <w:r>
         <w:rPr>
           <w:b/>
-          <w:sz w:val="22"/>
+          <w:lang w:val="en-CA"/>
         </w:rPr>
-        <w:t>Professional Development &amp; Technical Studies | Longueuil, Quebec, Canada</w:t>
+        <w:t>Bachelor’s Degree, Systems Engineering</w:t>
       </w:r>
       <w:r>
         <w:rPr>
-          <w:i/>
-          <w:sz w:val="20"/>
+          <w:b w:val="0"/>
+          <w:lang w:val="en-CA"/>
         </w:rPr>
-        <w:t xml:space="preserve">  -  Oct 2024 - Jun 2026</w:t>
+        <w:t xml:space="preserve">  |  Santiago Mariño Polytechnic University, Venezuela  |  2011</w:t>
       </w:r>
     </w:p>
     <w:p>
       <w:pPr>
-        <w:numPr>
-          <w:ilvl w:val="0"/>
-          <w:numId w:val="10"/>
-        </w:numPr>
-        <w:spacing w:before="80" w:after="0"/>
+        <w:pStyle w:val="CVEduX"/>
       </w:pPr>
       <w:r>
-        <w:t>Pursued two AEC programs at Champlain College: Cybersecurity (graduated February 2026) and IT Cloud Administration (graduated September 2026).</w:t>
+        <w:rPr>
+          <w:b/>
+          <w:lang w:val="en-CA"/>
+        </w:rPr>
+        <w:t>AEC, IT Cloud Administration</w:t>
+      </w:r>
+      <w:r>
+        <w:rPr>
+          <w:b w:val="0"/>
+          <w:lang w:val="en-CA"/>
+        </w:rPr>
+        <w:t xml:space="preserve">  |  Champlain College, Saint-Lambert, QC  |  Sep 2026</w:t>
       </w:r>
     </w:p>
     <w:p>
       <w:pPr>
-        <w:spacing w:before="80" w:after="0"/>
-        <w:rPr>
-          <w:i/>
-          <w:sz w:val="20"/>
-        </w:rPr>
+        <w:pStyle w:val="CVEduX"/>
       </w:pPr>
       <w:r>
         <w:rPr>
           <w:b/>
-          <w:sz w:val="22"/>
+          <w:lang w:val="en-CA"/>
         </w:rPr>
-        <w:t>Freelance Information Technology Consultant</w:t>
+        <w:t>AEC, Cybersecurity: Prevention and Intervention</w:t>
       </w:r>
       <w:r>
         <w:rPr>
-          <w:i/>
-          <w:sz w:val="20"/>
+          <w:b w:val="0"/>
+          <w:lang w:val="en-CA"/>
         </w:rPr>
-        <w:t xml:space="preserve">  -  Apr 2019 - Sep 2024</w:t>
+        <w:t xml:space="preserve">  |  Champlain College, Saint-Lambert, QC  |  Feb 2026</w:t>
       </w:r>
     </w:p>
     <w:p>
       <w:pPr>
-        <w:numPr>
-          <w:ilvl w:val="0"/>
-          <w:numId w:val="10"/>
-        </w:numPr>
-        <w:spacing w:before="80" w:after="0"/>
+        <w:pStyle w:val="CVSectionX"/>
+        <w:pBdr>
+          <w:bottom w:val="single" w:sz="4" w:space="2" w:color="999999"/>
+        </w:pBdr>
       </w:pPr>
       <w:r>
-        <w:t>Provided freelance IT systems administration, cloud technology support, and software development services, combining infrastructure management with application development.</w:t>
+        <w:rPr>
+          <w:b w:val="0"/>
+          <w:lang w:val="en-CA"/>
+        </w:rPr>
+        <w:t>PROFESSIONAL CERTIFICATIONS</w:t>
       </w:r>
     </w:p>
     <w:p>
       <w:pPr>
-        <w:numPr>
-          <w:ilvl w:val="0"/>
-          <w:numId w:val="10"/>
-        </w:numPr>
-        <w:spacing w:before="80" w:after="0"/>
+        <w:pStyle w:val="CVCertX"/>
       </w:pPr>
       <w:r>
-        <w:t>Administered and supported Windows Server 2016/2022, Active Directory, Group Policy (GPO), Microsoft 365, and VMware virtualized environments, focusing on reliability, performance, and security.</w:t>
+        <w:rPr>
+          <w:b/>
+          <w:lang w:val="en-CA"/>
+        </w:rPr>
+        <w:t>CompTIA CySA+</w:t>
+      </w:r>
+      <w:r>
+        <w:rPr>
+          <w:b w:val="0"/>
+          <w:lang w:val="en-CA"/>
+        </w:rPr>
+        <w:t xml:space="preserve">  |  Verified Credential ID: 7Q8BVEQ50FQQ1882</w:t>
       </w:r>
     </w:p>
     <w:p>
       <w:pPr>
-        <w:numPr>
-          <w:ilvl w:val="0"/>
-          <w:numId w:val="10"/>
-        </w:numPr>
-        <w:spacing w:before="80" w:after="0"/>
+        <w:pStyle w:val="CVCertX"/>
       </w:pPr>
       <w:r>
-        <w:t>Developed and maintained software applications using C#/.NET and Microsoft SQL Server, including database management, troubleshooting, and business application improvements.</w:t>
+        <w:rPr>
+          <w:b/>
+          <w:lang w:val="en-CA"/>
+        </w:rPr>
+        <w:t>CompTIA A+</w:t>
+      </w:r>
+      <w:r>
+        <w:rPr>
+          <w:b w:val="0"/>
+          <w:lang w:val="en-CA"/>
+        </w:rPr>
+        <w:t xml:space="preserve">  |  Verified Credential ID: C6LQT9FQ4BVEQ64J</w:t>
       </w:r>
     </w:p>
     <w:p>
       <w:pPr>
-        <w:numPr>
-          <w:ilvl w:val="0"/>
-          <w:numId w:val="10"/>
-        </w:numPr>
-        <w:spacing w:before="80" w:after="0"/>
+        <w:pStyle w:val="CVCertX"/>
       </w:pPr>
       <w:r>
-        <w:t>Supported cloud-connected environments, Microsoft 365 services, identity and access management, system configuration, and infrastructure troubleshooting.</w:t>
+        <w:rPr>
+          <w:b/>
+          <w:lang w:val="en-CA"/>
+        </w:rPr>
+        <w:t>CompTIA Tech+</w:t>
+      </w:r>
+      <w:r>
+        <w:rPr>
+          <w:b w:val="0"/>
+          <w:lang w:val="en-CA"/>
+        </w:rPr>
+        <w:t xml:space="preserve">  |  Verified Credential ID: EK360HJ5ZNBEC8LJ</w:t>
       </w:r>
     </w:p>
     <w:p>
       <w:pPr>
-        <w:numPr>
-          <w:ilvl w:val="0"/>
-          <w:numId w:val="10"/>
-        </w:numPr>
-        <w:spacing w:before="80" w:after="0"/>
+        <w:pStyle w:val="CVCertX"/>
       </w:pPr>
       <w:r>
-        <w:t>Used PowerShell and scripting techniques to automate IT administration tasks, improve operational efficiency, and streamline technical processes.</w:t>
+        <w:rPr>
+          <w:b/>
+          <w:lang w:val="en-CA"/>
+        </w:rPr>
+        <w:t>Cisco Certified Network Associate (CCNA)</w:t>
+      </w:r>
+      <w:r>
+        <w:rPr>
+          <w:b w:val="0"/>
+          <w:lang w:val="en-CA"/>
+        </w:rPr>
+        <w:t xml:space="preserve">  |  Verified Credential ID: f59e3cac390744c7aa6ed59210520a5c</w:t>
       </w:r>
     </w:p>
     <w:p>
       <w:pPr>
-        <w:numPr>
-          <w:ilvl w:val="0"/>
-          <w:numId w:val="10"/>
-        </w:numPr>
-        <w:spacing w:before="80" w:after="0"/>
+        <w:pStyle w:val="CVCertX"/>
       </w:pPr>
       <w:r>
-        <w:t>Provided Level 2 and Level 3 technical support, resolving Windows, networking, application, permissions, and infrastructure issues.</w:t>
+        <w:rPr>
+          <w:b/>
+          <w:lang w:val="en-CA"/>
+        </w:rPr>
+        <w:t>Microsoft Certified: Azure Security Engineer Associate (AZ-500)</w:t>
+      </w:r>
+      <w:r>
+        <w:rPr>
+          <w:b w:val="0"/>
+          <w:lang w:val="en-CA"/>
+        </w:rPr>
+        <w:t xml:space="preserve">  |  Credential ID: 92B71F0AB914408B</w:t>
       </w:r>
     </w:p>
     <w:p>
       <w:pPr>
-        <w:numPr>
-          <w:ilvl w:val="0"/>
-          <w:numId w:val="10"/>
-        </w:numPr>
-        <w:spacing w:before="80" w:after="0"/>
+        <w:pStyle w:val="CVCertX"/>
       </w:pPr>
       <w:r>
-        <w:t>Worked on software integration, system maintenance, performance optimization, technical documentation, and the implementation of reliable IT solutions.</w:t>
+        <w:rPr>
+          <w:b/>
+          <w:lang w:val="en-CA"/>
+        </w:rPr>
+        <w:t>Microsoft Certified: Azure Fundamentals (AZ-900)</w:t>
+      </w:r>
+      <w:r>
+        <w:rPr>
+          <w:b w:val="0"/>
+          <w:lang w:val="en-CA"/>
+        </w:rPr>
+        <w:t xml:space="preserve">  |  Credential ID: 561978C307D42ED3</w:t>
       </w:r>
     </w:p>
     <w:p>
       <w:pPr>
-        <w:numPr>
-          <w:ilvl w:val="0"/>
-          <w:numId w:val="10"/>
-        </w:numPr>
-        <w:spacing w:before="80" w:after="0"/>
-      </w:pPr>
-      <w:r>
-        <w:t>Combined software engineering and IT infrastructure expertise to support business operations, improve system functionality, and deliver practical technology solutions.</w:t>
-      </w:r>
-    </w:p>
-    <w:p>
-      <w:pPr>
-        <w:spacing w:before="80" w:after="0"/>
+        <w:pStyle w:val="CVSectionX"/>
+        <w:pBdr>
+          <w:bottom w:val="single" w:sz="4" w:space="2" w:color="999999"/>
+        </w:pBdr>
       </w:pPr>
       <w:r>
         <w:rPr>
-          <w:b/>
-        </w:rPr>
-        <w:t xml:space="preserve">Core Technologies: </w:t>
-      </w:r>
-      <w:r>
-        <w:t>C#, .NET, SQL Server, Windows Server, VMware, Active Directory, Group Policy, Microsoft 365, PowerShell, IT Infrastructure, Cloud Administration, Software Development, REST APIs.</w:t>
-      </w:r>
-    </w:p>
-    <w:p>
-      <w:pPr>
-        <w:spacing w:before="80" w:after="0"/>
-      </w:pPr>
-      <w:r>
-        <w:rPr>
-          <w:b/>
-          <w:sz w:val="22"/>
-        </w:rPr>
-        <w:t>Process Engineer | PDVSA | Petroleum Refinery</w:t>
-      </w:r>
-      <w:r>
-        <w:rPr>
-          <w:i/>
-          <w:sz w:val="20"/>
-        </w:rPr>
-        <w:t xml:space="preserve">  -  May 2014 - Apr 2019</w:t>
-      </w:r>
-    </w:p>
-    <w:p>
-      <w:pPr>
-        <w:spacing w:after="0"/>
-        <w:ind w:left="317" w:hanging="230"/>
-        <w:jc w:val="both"/>
-      </w:pPr>
-      <w:r>
-        <w:rPr>
-          <w:sz w:val="20"/>
-        </w:rPr>
-        <w:t>• Coordinated operational information and supported process documentation for plant activities across multiple departments.</w:t>
-      </w:r>
-    </w:p>
-    <w:p>
-      <w:pPr>
-        <w:spacing w:after="0"/>
-        <w:ind w:left="317" w:hanging="230"/>
-        <w:jc w:val="both"/>
-      </w:pPr>
-      <w:r>
-        <w:rPr>
-          <w:sz w:val="20"/>
-        </w:rPr>
-        <w:t>• Prepared technical and routine reports to support monitoring, compliance, and decision-making.</w:t>
-      </w:r>
-    </w:p>
-    <w:p>
-      <w:pPr>
-        <w:spacing w:after="0"/>
-        <w:ind w:left="317" w:hanging="230"/>
-        <w:jc w:val="both"/>
-      </w:pPr>
-      <w:r>
-        <w:rPr>
-          <w:sz w:val="20"/>
-        </w:rPr>
-        <w:t>• Maintained process records and collaborated with teams to improve workflow efficiency and control standards.</w:t>
-      </w:r>
-    </w:p>
-    <w:p>
-      <w:pPr>
-        <w:spacing w:before="80" w:after="0"/>
-        <w:jc w:val="both"/>
-      </w:pPr>
-      <w:r>
-        <w:rPr>
-          <w:b/>
-          <w:color w:val="366092"/>
-          <w:sz w:val="22"/>
-        </w:rPr>
-        <w:t xml:space="preserve">ERP Analyst | </w:t>
-      </w:r>
-      <w:r>
-        <w:rPr>
-          <w:b/>
-          <w:color w:val="366092"/>
-          <w:sz w:val="22"/>
-        </w:rPr>
-        <w:t>PDVSA | Petroleum Refinery</w:t>
-      </w:r>
-      <w:r>
-        <w:rPr>
-          <w:i/>
-          <w:sz w:val="20"/>
-        </w:rPr>
-        <w:t xml:space="preserve">    </w:t>
-      </w:r>
-      <w:r>
-        <w:rPr>
-          <w:b/>
-          <w:color w:val="366092"/>
-          <w:sz w:val="22"/>
-        </w:rPr>
-        <w:t>—</w:t>
-      </w:r>
-      <w:r>
-        <w:rPr>
-          <w:i/>
-          <w:sz w:val="20"/>
-        </w:rPr>
-        <w:t xml:space="preserve">    Mar 2013 – May 2014</w:t>
-      </w:r>
-    </w:p>
-    <w:p>
-      <w:pPr>
-        <w:spacing w:after="0"/>
-        <w:ind w:left="317" w:hanging="230"/>
-        <w:jc w:val="both"/>
-      </w:pPr>
-      <w:r>
-        <w:rPr>
-          <w:sz w:val="20"/>
-        </w:rPr>
-        <w:t>• Supported ERP operations, data maintenance, user requests, and testing activities to ensure reliable business system performance.</w:t>
-      </w:r>
-    </w:p>
-    <w:p>
-      <w:pPr>
-        <w:spacing w:after="0"/>
-        <w:ind w:left="317" w:hanging="230"/>
-        <w:jc w:val="both"/>
-      </w:pPr>
-      <w:r>
-        <w:rPr>
-          <w:sz w:val="20"/>
-        </w:rPr>
-        <w:t>• Assisted with issue resolution, documentation, and coordination of system updates.</w:t>
-      </w:r>
-    </w:p>
-    <w:p>
-      <w:pPr>
-        <w:spacing w:before="80" w:after="0"/>
-        <w:jc w:val="both"/>
-      </w:pPr>
-      <w:r>
-        <w:rPr>
-          <w:b/>
-          <w:color w:val="366092"/>
-          <w:sz w:val="22"/>
-        </w:rPr>
-        <w:t>Computer Trainer |</w:t>
-      </w:r>
-      <w:r>
-        <w:rPr>
-          <w:b/>
-          <w:color w:val="366092"/>
-          <w:sz w:val="22"/>
-        </w:rPr>
-        <w:t xml:space="preserve"> MPPE</w:t>
-      </w:r>
-      <w:r>
-        <w:rPr>
-          <w:b/>
-          <w:color w:val="366092"/>
-          <w:sz w:val="22"/>
-        </w:rPr>
-        <w:t xml:space="preserve"> </w:t>
-      </w:r>
-      <w:r>
-        <w:rPr>
-          <w:b/>
-          <w:color w:val="366092"/>
-          <w:sz w:val="22"/>
-        </w:rPr>
-        <w:t xml:space="preserve">| </w:t>
-      </w:r>
-      <w:r>
-        <w:rPr>
-          <w:b/>
-          <w:color w:val="366092"/>
-          <w:sz w:val="22"/>
-        </w:rPr>
-        <w:t>Ministry of Education</w:t>
-      </w:r>
-      <w:r>
-        <w:rPr>
-          <w:b/>
-          <w:color w:val="366092"/>
-          <w:sz w:val="22"/>
-        </w:rPr>
-        <w:t xml:space="preserve"> </w:t>
-      </w:r>
-      <w:r>
-        <w:rPr>
-          <w:b/>
-          <w:color w:val="366092"/>
-          <w:sz w:val="22"/>
-        </w:rPr>
-        <w:t>—</w:t>
-      </w:r>
-      <w:r>
-        <w:rPr>
-          <w:i/>
-          <w:sz w:val="20"/>
-        </w:rPr>
-        <w:t xml:space="preserve">    Jan 2000 – Mar 2013</w:t>
-      </w:r>
-    </w:p>
-    <w:p>
-      <w:pPr>
-        <w:spacing w:after="0"/>
-        <w:ind w:left="317" w:hanging="230"/>
-        <w:jc w:val="both"/>
-      </w:pPr>
-      <w:r>
-        <w:rPr>
-          <w:sz w:val="20"/>
-        </w:rPr>
-        <w:t>• Prepared training materials, tracked learner records, and provided user support for computer systems and software.</w:t>
-      </w:r>
-    </w:p>
-    <w:p>
-      <w:pPr>
-        <w:spacing w:after="0"/>
-        <w:ind w:left="317" w:hanging="230"/>
-        <w:jc w:val="both"/>
-      </w:pPr>
-      <w:r>
-        <w:rPr>
-          <w:sz w:val="20"/>
-        </w:rPr>
-        <w:t>• Delivered organized administrative and technical support in educational environments.</w:t>
-      </w:r>
-    </w:p>
-    <w:p>
-      <w:pPr>
-        <w:pBdr>
-          <w:bottom w:val="single" w:sz="6" w:space="1" w:color="9FBAD0"/>
-        </w:pBdr>
-        <w:spacing w:before="120" w:after="60"/>
-      </w:pPr>
-      <w:r>
-        <w:rPr>
-          <w:b/>
-          <w:color w:val="1F4E79"/>
-        </w:rPr>
-        <w:t>EDUCATION &amp; CERTIFICATIONS</w:t>
-      </w:r>
-    </w:p>
-    <w:p>
-      <w:pPr>
-        <w:spacing w:after="0"/>
-        <w:jc w:val="both"/>
-      </w:pPr>
-      <w:r>
-        <w:t>AEC - IT Cloud Administration (Graduated Sep 2026) - Champlain College - Saint-Lambert, QC, Canada</w:t>
-      </w:r>
-    </w:p>
-    <w:p>
-      <w:pPr>
-        <w:spacing w:after="0"/>
-        <w:ind w:left="317" w:hanging="230"/>
-        <w:jc w:val="both"/>
-      </w:pPr>
-      <w:r>
-        <w:t>AEC - Cybersecurity: Prevention and Intervention (Graduated Feb 2026) - Champlain College - Saint-Lambert, QC, Canada</w:t>
-      </w:r>
-    </w:p>
-    <w:p>
-      <w:pPr>
-        <w:spacing w:after="0"/>
-        <w:ind w:left="317" w:hanging="230"/>
-        <w:jc w:val="both"/>
-      </w:pPr>
-      <w:r>
-        <w:t>• System Engineer (</w:t>
-      </w:r>
-      <w:r>
-        <w:t>bachelor’s degree</w:t>
-      </w:r>
-      <w:r>
-        <w:t>) – Santiago Mariño Polytechnic University, Venezuela</w:t>
-      </w:r>
-    </w:p>
-    <w:p>
-      <w:pPr>
-        <w:spacing w:after="0"/>
-        <w:ind w:left="317" w:hanging="230"/>
-        <w:jc w:val="both"/>
-      </w:pPr>
-      <w:r>
-        <w:t>• Teacher Training (</w:t>
-      </w:r>
-      <w:r>
-        <w:t>bachelor’s degree</w:t>
-      </w:r>
-      <w:r>
-        <w:t>) – National Open University, Venezuela</w:t>
-      </w:r>
-    </w:p>
-    <w:p>
-      <w:pPr>
-        <w:spacing w:after="0"/>
-        <w:ind w:left="317" w:hanging="230"/>
-        <w:jc w:val="both"/>
-      </w:pPr>
-      <w:r>
-        <w:t>• Computer Technician (DEC) – Isaac Newton University Institute, Venezuela</w:t>
-      </w:r>
-    </w:p>
-    <w:p>
-      <w:pPr>
-        <w:pBdr>
-          <w:bottom w:val="single" w:sz="6" w:space="1" w:color="9FBAD0"/>
-        </w:pBdr>
-        <w:spacing w:before="120" w:after="60"/>
-        <w:rPr>
-          <w:b/>
-          <w:color w:val="1F4E79"/>
-        </w:rPr>
-      </w:pPr>
-      <w:r>
-        <w:rPr>
-          <w:rStyle w:val="Strong"/>
-        </w:rPr>
-        <w:t>Certifications</w:t>
-      </w:r>
-      <w:r>
-        <w:br/>
-        <w:t xml:space="preserve">• </w:t>
-      </w:r>
-      <w:r>
-        <w:rPr>
-          <w:rStyle w:val="Strong"/>
-        </w:rPr>
-        <w:t xml:space="preserve">CompTIA </w:t>
-      </w:r>
-      <w:proofErr w:type="spellStart"/>
-      <w:r>
-        <w:rPr>
-          <w:rStyle w:val="Strong"/>
-        </w:rPr>
-        <w:t>CySA</w:t>
-      </w:r>
-      <w:proofErr w:type="spellEnd"/>
-      <w:r>
-        <w:rPr>
-          <w:rStyle w:val="Strong"/>
-        </w:rPr>
-        <w:t>+</w:t>
-      </w:r>
-      <w:r>
-        <w:t xml:space="preserve"> | Verified Credential ID: 7Q8BVEQ50FQQ1882</w:t>
-      </w:r>
-      <w:r>
-        <w:br/>
-        <w:t xml:space="preserve">• </w:t>
-      </w:r>
-      <w:r>
-        <w:rPr>
-          <w:rStyle w:val="Strong"/>
-        </w:rPr>
-        <w:t>CompTIA A+</w:t>
-      </w:r>
-      <w:r>
-        <w:t xml:space="preserve"> | Verified Credential ID: C6LQT9FQ4BVEQ64J</w:t>
-      </w:r>
-      <w:r>
-        <w:br/>
-        <w:t xml:space="preserve">• </w:t>
-      </w:r>
-      <w:r>
-        <w:rPr>
-          <w:rStyle w:val="Strong"/>
-        </w:rPr>
-        <w:t>CompTIA Tech+</w:t>
-      </w:r>
-      <w:r>
-        <w:t xml:space="preserve"> | Verified Credential ID: EK360HJ5ZNBEC8LJ</w:t>
-      </w:r>
-      <w:r>
-        <w:br/>
-        <w:t xml:space="preserve">• </w:t>
-      </w:r>
-      <w:r>
-        <w:rPr>
-          <w:rStyle w:val="Strong"/>
-        </w:rPr>
-        <w:t>Cisco Certified Network Associate (CCNA)</w:t>
-      </w:r>
-      <w:r>
-        <w:t xml:space="preserve"> | Verified Credential ID: f59e3cac390744c7aa6ed59210520a5c</w:t>
-      </w:r>
-      <w:r>
-        <w:br/>
-        <w:t xml:space="preserve">• </w:t>
-      </w:r>
-      <w:r>
-        <w:rPr>
-          <w:rStyle w:val="Strong"/>
-        </w:rPr>
-        <w:t>Microsoft Certified: Azure Security Engineer Associate (AZ-500)</w:t>
-      </w:r>
-      <w:r>
-        <w:t xml:space="preserve"> | </w:t>
-      </w:r>
-      <w:r>
-        <w:t>Credential ID: 92B71F0AB914408B</w:t>
-      </w:r>
-      <w:r>
-        <w:br/>
-        <w:t xml:space="preserve">• </w:t>
-      </w:r>
-      <w:r>
-        <w:rPr>
-          <w:rStyle w:val="Strong"/>
-        </w:rPr>
-        <w:t>Microsoft Certified: Azure Fundamentals (AZ-900)</w:t>
-      </w:r>
-      <w:r>
-        <w:t xml:space="preserve"> | </w:t>
-      </w:r>
-      <w:r>
-        <w:t>Credential ID: 561978C307D42ED3</w:t>
-      </w:r>
-    </w:p>
-    <w:p>
-      <w:pPr>
-        <w:pBdr>
-          <w:bottom w:val="single" w:sz="6" w:space="1" w:color="9FBAD0"/>
-        </w:pBdr>
-        <w:spacing w:before="120" w:after="60"/>
-      </w:pPr>
-      <w:r>
-        <w:rPr>
-          <w:b/>
-          <w:color w:val="1F4E79"/>
+          <w:b w:val="0"/>
+          <w:lang w:val="en-CA"/>
         </w:rPr>
         <w:t>LANGUAGES</w:t>
       </w:r>
     </w:p>
     <w:p>
       <w:pPr>
-        <w:spacing w:after="0"/>
+        <w:pStyle w:val="CVEduX"/>
       </w:pPr>
       <w:r>
-        <w:t xml:space="preserve">Spanish: </w:t>
-      </w:r>
-      <w:proofErr w:type="gramStart"/>
-      <w:r>
-        <w:t>Native  |</w:t>
-      </w:r>
-      <w:proofErr w:type="gramEnd"/>
-      <w:r>
-        <w:t xml:space="preserve">  English: </w:t>
-      </w:r>
-      <w:proofErr w:type="gramStart"/>
-      <w:r>
-        <w:t>Fluent  |</w:t>
-      </w:r>
-      <w:proofErr w:type="gramEnd"/>
-      <w:r>
-        <w:t xml:space="preserve">  French: </w:t>
-      </w:r>
-      <w:r>
-        <w:t>Basic</w:t>
+        <w:rPr>
+          <w:b w:val="0"/>
+          <w:lang w:val="en-CA"/>
+        </w:rPr>
+        <w:t>English: Fluent  |  French: Basic  |  Spanish: Native</w:t>
       </w:r>
     </w:p>
     <w:sectPr>
-      <w:headerReference w:type="default" r:id="rId14"/>
       <w:pgSz w:w="12240" w:h="15840"/>
-      <w:pgMar w:top="792" w:right="1080" w:bottom="792" w:left="1080" w:header="720" w:footer="720" w:gutter="0"/>
+      <w:pgMar w:top="821" w:right="965" w:bottom="806" w:left="965" w:header="403" w:footer="403" w:gutter="0"/>
       <w:cols w:space="720"/>
       <w:docGrid w:linePitch="360"/>
     </w:sectPr>
   </w:body>
 </w:document>
-</file>
-
-<file path=word/endnotes.xml><?xml version="1.0" encoding="utf-8"?>
-<w:endnotes xmlns:wpc="http://schemas.microsoft.com/office/word/2010/wordprocessingCanvas" xmlns:cx="http://schemas.microsoft.com/office/drawing/2014/chartex" xmlns:cx1="http://schemas.microsoft.com/office/drawing/2015/9/8/chartex" xmlns:cx2="http://schemas.microsoft.com/office/drawing/2015/10/21/chartex" xmlns:cx3="http://schemas.microsoft.com/office/drawing/2016/5/9/chartex" xmlns:cx4="http://schemas.microsoft.com/office/drawing/2016/5/10/chartex" xmlns:cx5="http://schemas.microsoft.com/office/drawing/2016/5/11/chartex" xmlns:cx6="http://schemas.microsoft.com/office/drawing/2016/5/12/chartex" xmlns:cx7="http://schemas.microsoft.com/office/drawing/2016/5/13/chartex" xmlns:cx8="http://schemas.microsoft.com/office/drawing/2016/5/14/chartex" xmlns:mc="http://schemas.openxmlformats.org/markup-compatibility/2006" xmlns:aink="http://schemas.microsoft.com/office/drawing/2016/ink" xmlns:am3d="http://schemas.microsoft.com/office/drawing/2017/model3d" xmlns:o="urn:schemas-microsoft-com:office:office" xmlns:oel="http://schemas.microsoft.com/office/2019/extlst" xmlns:r="http://schemas.openxmlformats.org/officeDocument/2006/relationships" xmlns:m="http://schemas.openxmlformats.org/officeDocument/2006/math" xmlns:v="urn:schemas-microsoft-com:vml" xmlns:wp14="http://schemas.microsoft.com/office/word/2010/wordprocessingDrawing" xmlns:wp="http://schemas.openxmlformats.org/drawingml/2006/wordprocessingDrawing" xmlns:w10="urn:schemas-microsoft-com:office:word" xmlns:w="http://schemas.openxmlformats.org/wordprocessingml/2006/main" xmlns:w14="http://schemas.microsoft.com/office/word/2010/wordml" xmlns:w15="http://schemas.microsoft.com/office/word/2012/wordml" xmlns:w16cex="http://schemas.microsoft.com/office/word/2018/wordml/cex" xmlns:w16cid="http://schemas.microsoft.com/office/word/2016/wordml/cid" xmlns:w16="http://schemas.microsoft.com/office/word/2018/wordml" xmlns:w16du="http://schemas.microsoft.com/office/word/2023/wordml/word16du" xmlns:w16sdtdh="http://schemas.microsoft.com/office/word/2020/wordml/sdtdatahash" xmlns:w16sdtfl="http://schemas.microsoft.com/office/word/2024/wordml/sdtformatlock" xmlns:w16se="http://schemas.microsoft.com/office/word/2015/wordml/symex" xmlns:wpg="http://schemas.microsoft.com/office/word/2010/wordprocessingGroup" xmlns:wpi="http://schemas.microsoft.com/office/word/2010/wordprocessingInk" xmlns:wne="http://schemas.microsoft.com/office/word/2006/wordml" xmlns:wps="http://schemas.microsoft.com/office/word/2010/wordprocessingShape" mc:Ignorable="w14 w15 w16se w16cid w16 w16cex w16sdtdh w16sdtfl w16du wp14">
-  <w:endnote w:type="separator" w:id="-1">
-    <w:p>
-      <w:pPr>
-        <w:spacing w:after="0" w:line="240" w:lineRule="auto"/>
-      </w:pPr>
-      <w:r>
-        <w:separator/>
-      </w:r>
-    </w:p>
-  </w:endnote>
-  <w:endnote w:type="continuationSeparator" w:id="0">
-    <w:p>
-      <w:pPr>
-        <w:spacing w:after="0" w:line="240" w:lineRule="auto"/>
-      </w:pPr>
-      <w:r>
-        <w:continuationSeparator/>
-      </w:r>
-    </w:p>
-  </w:endnote>
-</w:endnotes>
-</file>
-
-<file path=word/footnotes.xml><?xml version="1.0" encoding="utf-8"?>
-<w:footnotes xmlns:wpc="http://schemas.microsoft.com/office/word/2010/wordprocessingCanvas" xmlns:cx="http://schemas.microsoft.com/office/drawing/2014/chartex" xmlns:cx1="http://schemas.microsoft.com/office/drawing/2015/9/8/chartex" xmlns:cx2="http://schemas.microsoft.com/office/drawing/2015/10/21/chartex" xmlns:cx3="http://schemas.microsoft.com/office/drawing/2016/5/9/chartex" xmlns:cx4="http://schemas.microsoft.com/office/drawing/2016/5/10/chartex" xmlns:cx5="http://schemas.microsoft.com/office/drawing/2016/5/11/chartex" xmlns:cx6="http://schemas.microsoft.com/office/drawing/2016/5/12/chartex" xmlns:cx7="http://schemas.microsoft.com/office/drawing/2016/5/13/chartex" xmlns:cx8="http://schemas.microsoft.com/office/drawing/2016/5/14/chartex" xmlns:mc="http://schemas.openxmlformats.org/markup-compatibility/2006" xmlns:aink="http://schemas.microsoft.com/office/drawing/2016/ink" xmlns:am3d="http://schemas.microsoft.com/office/drawing/2017/model3d" xmlns:o="urn:schemas-microsoft-com:office:office" xmlns:oel="http://schemas.microsoft.com/office/2019/extlst" xmlns:r="http://schemas.openxmlformats.org/officeDocument/2006/relationships" xmlns:m="http://schemas.openxmlformats.org/officeDocument/2006/math" xmlns:v="urn:schemas-microsoft-com:vml" xmlns:wp14="http://schemas.microsoft.com/office/word/2010/wordprocessingDrawing" xmlns:wp="http://schemas.openxmlformats.org/drawingml/2006/wordprocessingDrawing" xmlns:w10="urn:schemas-microsoft-com:office:word" xmlns:w="http://schemas.openxmlformats.org/wordprocessingml/2006/main" xmlns:w14="http://schemas.microsoft.com/office/word/2010/wordml" xmlns:w15="http://schemas.microsoft.com/office/word/2012/wordml" xmlns:w16cex="http://schemas.microsoft.com/office/word/2018/wordml/cex" xmlns:w16cid="http://schemas.microsoft.com/office/word/2016/wordml/cid" xmlns:w16="http://schemas.microsoft.com/office/word/2018/wordml" xmlns:w16du="http://schemas.microsoft.com/office/word/2023/wordml/word16du" xmlns:w16sdtdh="http://schemas.microsoft.com/office/word/2020/wordml/sdtdatahash" xmlns:w16sdtfl="http://schemas.microsoft.com/office/word/2024/wordml/sdtformatlock" xmlns:w16se="http://schemas.microsoft.com/office/word/2015/wordml/symex" xmlns:wpg="http://schemas.microsoft.com/office/word/2010/wordprocessingGroup" xmlns:wpi="http://schemas.microsoft.com/office/word/2010/wordprocessingInk" xmlns:wne="http://schemas.microsoft.com/office/word/2006/wordml" xmlns:wps="http://schemas.microsoft.com/office/word/2010/wordprocessingShape" mc:Ignorable="w14 w15 w16se w16cid w16 w16cex w16sdtdh w16sdtfl w16du wp14">
-  <w:footnote w:type="separator" w:id="-1">
-    <w:p>
-      <w:pPr>
-        <w:spacing w:after="0" w:line="240" w:lineRule="auto"/>
-      </w:pPr>
-      <w:r>
-        <w:separator/>
-      </w:r>
-    </w:p>
-  </w:footnote>
-  <w:footnote w:type="continuationSeparator" w:id="0">
-    <w:p>
-      <w:pPr>
-        <w:spacing w:after="0" w:line="240" w:lineRule="auto"/>
-      </w:pPr>
-      <w:r>
-        <w:continuationSeparator/>
-      </w:r>
-    </w:p>
-  </w:footnote>
-</w:footnotes>
-</file>
-
-<file path=word/header1.xml><?xml version="1.0" encoding="utf-8"?>
-<w:hdr xmlns:wpc="http://schemas.microsoft.com/office/word/2010/wordprocessingCanvas" xmlns:cx="http://schemas.microsoft.com/office/drawing/2014/chartex" xmlns:cx1="http://schemas.microsoft.com/office/drawing/2015/9/8/chartex" xmlns:cx2="http://schemas.microsoft.com/office/drawing/2015/10/21/chartex" xmlns:cx3="http://schemas.microsoft.com/office/drawing/2016/5/9/chartex" xmlns:cx4="http://schemas.microsoft.com/office/drawing/2016/5/10/chartex" xmlns:cx5="http://schemas.microsoft.com/office/drawing/2016/5/11/chartex" xmlns:cx6="http://schemas.microsoft.com/office/drawing/2016/5/12/chartex" xmlns:cx7="http://schemas.microsoft.com/office/drawing/2016/5/13/chartex" xmlns:cx8="http://schemas.microsoft.com/office/drawing/2016/5/14/chartex" xmlns:mc="http://schemas.openxmlformats.org/markup-compatibility/2006" xmlns:aink="http://schemas.microsoft.com/office/drawing/2016/ink" xmlns:am3d="http://schemas.microsoft.com/office/drawing/2017/model3d" xmlns:o="urn:schemas-microsoft-com:office:office" xmlns:oel="http://schemas.microsoft.com/office/2019/extlst" xmlns:r="http://schemas.openxmlformats.org/officeDocument/2006/relationships" xmlns:m="http://schemas.openxmlformats.org/officeDocument/2006/math" xmlns:v="urn:schemas-microsoft-com:vml" xmlns:wp14="http://schemas.microsoft.com/office/word/2010/wordprocessingDrawing" xmlns:wp="http://schemas.openxmlformats.org/drawingml/2006/wordprocessingDrawing" xmlns:w10="urn:schemas-microsoft-com:office:word" xmlns:w="http://schemas.openxmlformats.org/wordprocessingml/2006/main" xmlns:w14="http://schemas.microsoft.com/office/word/2010/wordml" xmlns:w15="http://schemas.microsoft.com/office/word/2012/wordml" xmlns:w16cex="http://schemas.microsoft.com/office/word/2018/wordml/cex" xmlns:w16cid="http://schemas.microsoft.com/office/word/2016/wordml/cid" xmlns:w16="http://schemas.microsoft.com/office/word/2018/wordml" xmlns:w16du="http://schemas.microsoft.com/office/word/2023/wordml/word16du" xmlns:w16sdtdh="http://schemas.microsoft.com/office/word/2020/wordml/sdtdatahash" xmlns:w16sdtfl="http://schemas.microsoft.com/office/word/2024/wordml/sdtformatlock" xmlns:w16se="http://schemas.microsoft.com/office/word/2015/wordml/symex" xmlns:wpg="http://schemas.microsoft.com/office/word/2010/wordprocessingGroup" xmlns:wpi="http://schemas.microsoft.com/office/word/2010/wordprocessingInk" xmlns:wne="http://schemas.microsoft.com/office/word/2006/wordml" xmlns:wps="http://schemas.microsoft.com/office/word/2010/wordprocessingShape" mc:Ignorable="w14 w15 w16se w16cid w16 w16cex w16sdtdh w16sdtfl w16du wp14">
-  <w:p>
-    <w:pPr>
-      <w:pStyle w:val="Header"/>
-    </w:pPr>
-    <w:r>
-      <w:rPr>
-        <w:noProof/>
-      </w:rPr>
-      <mc:AlternateContent>
-        <mc:Choice Requires="wpg">
-          <w:drawing>
-            <wp:anchor distT="0" distB="0" distL="114300" distR="114300" simplePos="0" relativeHeight="251659264" behindDoc="0" locked="0" layoutInCell="1" allowOverlap="1" wp14:anchorId="6D47B4DF" wp14:editId="42B7FDE5">
-              <wp:simplePos x="0" y="0"/>
-              <wp:positionH relativeFrom="column">
-                <wp:posOffset>-685800</wp:posOffset>
-              </wp:positionH>
-              <wp:positionV relativeFrom="paragraph">
-                <wp:posOffset>-228600</wp:posOffset>
-              </wp:positionV>
-              <wp:extent cx="1700784" cy="1024128"/>
-              <wp:effectExtent l="0" t="0" r="0" b="5080"/>
-              <wp:wrapNone/>
-              <wp:docPr id="776264329" name="Group 1"/>
-              <wp:cNvGraphicFramePr/>
-              <a:graphic xmlns:a="http://schemas.openxmlformats.org/drawingml/2006/main">
-                <a:graphicData uri="http://schemas.microsoft.com/office/word/2010/wordprocessingGroup">
-                  <wpg:wgp>
-                    <wpg:cNvGrpSpPr/>
-                    <wpg:grpSpPr>
-                      <a:xfrm>
-                        <a:off x="0" y="0"/>
-                        <a:ext cx="1700784" cy="1024128"/>
-                        <a:chOff x="0" y="0"/>
-                        <a:chExt cx="1700784" cy="1024128"/>
-                      </a:xfrm>
-                    </wpg:grpSpPr>
-                    <wps:wsp>
-                      <wps:cNvPr id="998252387" name="Rectangle 998252387"/>
-                      <wps:cNvSpPr/>
-                      <wps:spPr>
-                        <a:xfrm>
-                          <a:off x="0" y="0"/>
-                          <a:ext cx="1700784" cy="1024128"/>
-                        </a:xfrm>
-                        <a:prstGeom prst="rect">
-                          <a:avLst/>
-                        </a:prstGeom>
-                        <a:solidFill>
-                          <a:schemeClr val="bg1">
-                            <a:alpha val="0"/>
-                          </a:schemeClr>
-                        </a:solidFill>
-                        <a:ln>
-                          <a:noFill/>
-                        </a:ln>
-                      </wps:spPr>
-                      <wps:style>
-                        <a:lnRef idx="2">
-                          <a:schemeClr val="accent1">
-                            <a:shade val="50000"/>
-                          </a:schemeClr>
-                        </a:lnRef>
-                        <a:fillRef idx="1">
-                          <a:schemeClr val="accent1"/>
-                        </a:fillRef>
-                        <a:effectRef idx="0">
-                          <a:schemeClr val="accent1"/>
-                        </a:effectRef>
-                        <a:fontRef idx="minor">
-                          <a:schemeClr val="lt1"/>
-                        </a:fontRef>
-                      </wps:style>
-                      <wps:bodyPr rot="0" spcFirstLastPara="0" vertOverflow="overflow" horzOverflow="overflow" vert="horz" wrap="square" lIns="91440" tIns="45720" rIns="91440" bIns="45720" numCol="1" spcCol="0" rtlCol="0" fromWordArt="0" anchor="ctr" anchorCtr="0" forceAA="0" compatLnSpc="1">
-                        <a:prstTxWarp prst="textNoShape">
-                          <a:avLst/>
-                        </a:prstTxWarp>
-                        <a:noAutofit/>
-                      </wps:bodyPr>
-                    </wps:wsp>
-                    <wps:wsp>
-                      <wps:cNvPr id="856973705" name="Rectangle 1"/>
-                      <wps:cNvSpPr/>
-                      <wps:spPr>
-                        <a:xfrm>
-                          <a:off x="228600" y="0"/>
-                          <a:ext cx="1463040" cy="1014984"/>
-                        </a:xfrm>
-                        <a:custGeom>
-                          <a:avLst/>
-                          <a:gdLst>
-                            <a:gd name="connsiteX0" fmla="*/ 0 w 1462822"/>
-                            <a:gd name="connsiteY0" fmla="*/ 0 h 1014481"/>
-                            <a:gd name="connsiteX1" fmla="*/ 1462822 w 1462822"/>
-                            <a:gd name="connsiteY1" fmla="*/ 0 h 1014481"/>
-                            <a:gd name="connsiteX2" fmla="*/ 1462822 w 1462822"/>
-                            <a:gd name="connsiteY2" fmla="*/ 1014481 h 1014481"/>
-                            <a:gd name="connsiteX3" fmla="*/ 0 w 1462822"/>
-                            <a:gd name="connsiteY3" fmla="*/ 1014481 h 1014481"/>
-                            <a:gd name="connsiteX4" fmla="*/ 0 w 1462822"/>
-                            <a:gd name="connsiteY4" fmla="*/ 0 h 1014481"/>
-                            <a:gd name="connsiteX0" fmla="*/ 0 w 1462822"/>
-                            <a:gd name="connsiteY0" fmla="*/ 0 h 1014481"/>
-                            <a:gd name="connsiteX1" fmla="*/ 1462822 w 1462822"/>
-                            <a:gd name="connsiteY1" fmla="*/ 0 h 1014481"/>
-                            <a:gd name="connsiteX2" fmla="*/ 910372 w 1462822"/>
-                            <a:gd name="connsiteY2" fmla="*/ 376306 h 1014481"/>
-                            <a:gd name="connsiteX3" fmla="*/ 0 w 1462822"/>
-                            <a:gd name="connsiteY3" fmla="*/ 1014481 h 1014481"/>
-                            <a:gd name="connsiteX4" fmla="*/ 0 w 1462822"/>
-                            <a:gd name="connsiteY4" fmla="*/ 0 h 1014481"/>
-                          </a:gdLst>
-                          <a:ahLst/>
-                          <a:cxnLst>
-                            <a:cxn ang="0">
-                              <a:pos x="connsiteX0" y="connsiteY0"/>
-                            </a:cxn>
-                            <a:cxn ang="0">
-                              <a:pos x="connsiteX1" y="connsiteY1"/>
-                            </a:cxn>
-                            <a:cxn ang="0">
-                              <a:pos x="connsiteX2" y="connsiteY2"/>
-                            </a:cxn>
-                            <a:cxn ang="0">
-                              <a:pos x="connsiteX3" y="connsiteY3"/>
-                            </a:cxn>
-                            <a:cxn ang="0">
-                              <a:pos x="connsiteX4" y="connsiteY4"/>
-                            </a:cxn>
-                          </a:cxnLst>
-                          <a:rect l="l" t="t" r="r" b="b"/>
-                          <a:pathLst>
-                            <a:path w="1462822" h="1014481">
-                              <a:moveTo>
-                                <a:pt x="0" y="0"/>
-                              </a:moveTo>
-                              <a:lnTo>
-                                <a:pt x="1462822" y="0"/>
-                              </a:lnTo>
-                              <a:lnTo>
-                                <a:pt x="910372" y="376306"/>
-                              </a:lnTo>
-                              <a:lnTo>
-                                <a:pt x="0" y="1014481"/>
-                              </a:lnTo>
-                              <a:lnTo>
-                                <a:pt x="0" y="0"/>
-                              </a:lnTo>
-                              <a:close/>
-                            </a:path>
-                          </a:pathLst>
-                        </a:custGeom>
-                        <a:solidFill>
-                          <a:schemeClr val="accent1"/>
-                        </a:solidFill>
-                        <a:ln>
-                          <a:noFill/>
-                        </a:ln>
-                      </wps:spPr>
-                      <wps:style>
-                        <a:lnRef idx="2">
-                          <a:schemeClr val="accent1">
-                            <a:shade val="50000"/>
-                          </a:schemeClr>
-                        </a:lnRef>
-                        <a:fillRef idx="1">
-                          <a:schemeClr val="accent1"/>
-                        </a:fillRef>
-                        <a:effectRef idx="0">
-                          <a:schemeClr val="accent1"/>
-                        </a:effectRef>
-                        <a:fontRef idx="minor">
-                          <a:schemeClr val="lt1"/>
-                        </a:fontRef>
-                      </wps:style>
-                      <wps:bodyPr rot="0" spcFirstLastPara="0" vertOverflow="overflow" horzOverflow="overflow" vert="horz" wrap="square" lIns="91440" tIns="45720" rIns="91440" bIns="45720" numCol="1" spcCol="0" rtlCol="0" fromWordArt="0" anchor="ctr" anchorCtr="0" forceAA="0" compatLnSpc="1">
-                        <a:prstTxWarp prst="textNoShape">
-                          <a:avLst/>
-                        </a:prstTxWarp>
-                        <a:noAutofit/>
-                      </wps:bodyPr>
-                    </wps:wsp>
-                    <wps:wsp>
-                      <wps:cNvPr id="667651671" name="Rectangle 667651671"/>
-                      <wps:cNvSpPr/>
-                      <wps:spPr>
-                        <a:xfrm>
-                          <a:off x="228600" y="0"/>
-                          <a:ext cx="1472184" cy="1024128"/>
-                        </a:xfrm>
-                        <a:prstGeom prst="rect">
-                          <a:avLst/>
-                        </a:prstGeom>
-                        <a:blipFill>
-                          <a:blip r:embed="rId1"/>
-                          <a:stretch>
-                            <a:fillRect/>
-                          </a:stretch>
-                        </a:blipFill>
-                        <a:ln>
-                          <a:noFill/>
-                        </a:ln>
-                      </wps:spPr>
-                      <wps:style>
-                        <a:lnRef idx="2">
-                          <a:schemeClr val="accent1">
-                            <a:shade val="50000"/>
-                          </a:schemeClr>
-                        </a:lnRef>
-                        <a:fillRef idx="1">
-                          <a:schemeClr val="accent1"/>
-                        </a:fillRef>
-                        <a:effectRef idx="0">
-                          <a:schemeClr val="accent1"/>
-                        </a:effectRef>
-                        <a:fontRef idx="minor">
-                          <a:schemeClr val="lt1"/>
-                        </a:fontRef>
-                      </wps:style>
-                      <wps:bodyPr rot="0" spcFirstLastPara="0" vertOverflow="overflow" horzOverflow="overflow" vert="horz" wrap="square" lIns="91440" tIns="45720" rIns="91440" bIns="45720" numCol="1" spcCol="0" rtlCol="0" fromWordArt="0" anchor="ctr" anchorCtr="0" forceAA="0" compatLnSpc="1">
-                        <a:prstTxWarp prst="textNoShape">
-                          <a:avLst/>
-                        </a:prstTxWarp>
-                        <a:noAutofit/>
-                      </wps:bodyPr>
-                    </wps:wsp>
-                  </wpg:wgp>
-                </a:graphicData>
-              </a:graphic>
-            </wp:anchor>
-          </w:drawing>
-        </mc:Choice>
-        <mc:Fallback>
-          <w:pict>
-            <v:group w14:anchorId="76BDA26F" id="Group 1" o:spid="_x0000_s1026" style="position:absolute;margin-left:-54pt;margin-top:-18pt;width:133.9pt;height:80.65pt;z-index:251659264" coordsize="17007,10241" o:gfxdata="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">
-              <v:rect id="Rectangle 998252387" o:spid="_x0000_s1027" style="position:absolute;width:17007;height:10241;visibility:visible;mso-wrap-style:square;v-text-anchor:middle" o:gfxdata="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" fillcolor="white [3212]" stroked="f" strokeweight="2pt">
-                <v:fill opacity="0"/>
-              </v:rect>
-              <v:shape id="Rectangle 1" o:spid="_x0000_s1028" style="position:absolute;left:2286;width:14630;height:10149;visibility:visible;mso-wrap-style:square;v-text-anchor:middle" coordsize="1462822,1014481" o:gfxdata="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" path="m,l1462822,,910372,376306,,1014481,,xe" fillcolor="#4f81bd [3204]" stroked="f" strokeweight="2pt">
-                <v:path arrowok="t" o:connecttype="custom" o:connectlocs="0,0;1463040,0;910508,376493;0,1014984;0,0" o:connectangles="0,0,0,0,0"/>
-              </v:shape>
-              <v:rect id="Rectangle 667651671" o:spid="_x0000_s1029" style="position:absolute;left:2286;width:14721;height:10241;visibility:visible;mso-wrap-style:square;v-text-anchor:middle" o:gfxdata="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" stroked="f" strokeweight="2pt">
-                <v:fill r:id="rId2" o:title="" recolor="t" rotate="t" type="frame"/>
-              </v:rect>
-            </v:group>
-          </w:pict>
-        </mc:Fallback>
-      </mc:AlternateContent>
-    </w:r>
-  </w:p>
-</w:hdr>
 </file>
 
 <file path=word/numbering.xml><?xml version="1.0" encoding="utf-8"?>
@@ -2295,187 +886,32 @@
       </w:rPr>
     </w:lvl>
   </w:abstractNum>
-  <w:abstractNum w:abstractNumId="9" w15:restartNumberingAfterBreak="0">
-    <w:nsid w:val="28575E74"/>
-    <w:multiLevelType w:val="multilevel"/>
-    <w:tmpl w:val="A11C41FE"/>
-    <w:lvl w:ilvl="0">
-      <w:start w:val="1"/>
-      <w:numFmt w:val="bullet"/>
-      <w:lvlText w:val=""/>
-      <w:lvlJc w:val="left"/>
-      <w:pPr>
-        <w:tabs>
-          <w:tab w:val="num" w:pos="720"/>
-        </w:tabs>
-        <w:ind w:left="720" w:hanging="360"/>
-      </w:pPr>
-      <w:rPr>
-        <w:rFonts w:ascii="Symbol" w:hAnsi="Symbol" w:hint="default"/>
-        <w:sz w:val="20"/>
-      </w:rPr>
-    </w:lvl>
-    <w:lvl w:ilvl="1" w:tentative="1">
-      <w:start w:val="1"/>
-      <w:numFmt w:val="bullet"/>
-      <w:lvlText w:val="o"/>
-      <w:lvlJc w:val="left"/>
-      <w:pPr>
-        <w:tabs>
-          <w:tab w:val="num" w:pos="1440"/>
-        </w:tabs>
-        <w:ind w:left="1440" w:hanging="360"/>
-      </w:pPr>
-      <w:rPr>
-        <w:rFonts w:ascii="Courier New" w:hAnsi="Courier New" w:hint="default"/>
-        <w:sz w:val="20"/>
-      </w:rPr>
-    </w:lvl>
-    <w:lvl w:ilvl="2" w:tentative="1">
-      <w:start w:val="1"/>
-      <w:numFmt w:val="bullet"/>
-      <w:lvlText w:val=""/>
-      <w:lvlJc w:val="left"/>
-      <w:pPr>
-        <w:tabs>
-          <w:tab w:val="num" w:pos="2160"/>
-        </w:tabs>
-        <w:ind w:left="2160" w:hanging="360"/>
-      </w:pPr>
-      <w:rPr>
-        <w:rFonts w:ascii="Wingdings" w:hAnsi="Wingdings" w:hint="default"/>
-        <w:sz w:val="20"/>
-      </w:rPr>
-    </w:lvl>
-    <w:lvl w:ilvl="3" w:tentative="1">
-      <w:start w:val="1"/>
-      <w:numFmt w:val="bullet"/>
-      <w:lvlText w:val=""/>
-      <w:lvlJc w:val="left"/>
-      <w:pPr>
-        <w:tabs>
-          <w:tab w:val="num" w:pos="2880"/>
-        </w:tabs>
-        <w:ind w:left="2880" w:hanging="360"/>
-      </w:pPr>
-      <w:rPr>
-        <w:rFonts w:ascii="Wingdings" w:hAnsi="Wingdings" w:hint="default"/>
-        <w:sz w:val="20"/>
-      </w:rPr>
-    </w:lvl>
-    <w:lvl w:ilvl="4" w:tentative="1">
-      <w:start w:val="1"/>
-      <w:numFmt w:val="bullet"/>
-      <w:lvlText w:val=""/>
-      <w:lvlJc w:val="left"/>
-      <w:pPr>
-        <w:tabs>
-          <w:tab w:val="num" w:pos="3600"/>
-        </w:tabs>
-        <w:ind w:left="3600" w:hanging="360"/>
-      </w:pPr>
-      <w:rPr>
-        <w:rFonts w:ascii="Wingdings" w:hAnsi="Wingdings" w:hint="default"/>
-        <w:sz w:val="20"/>
-      </w:rPr>
-    </w:lvl>
-    <w:lvl w:ilvl="5" w:tentative="1">
-      <w:start w:val="1"/>
-      <w:numFmt w:val="bullet"/>
-      <w:lvlText w:val=""/>
-      <w:lvlJc w:val="left"/>
-      <w:pPr>
-        <w:tabs>
-          <w:tab w:val="num" w:pos="4320"/>
-        </w:tabs>
-        <w:ind w:left="4320" w:hanging="360"/>
-      </w:pPr>
-      <w:rPr>
-        <w:rFonts w:ascii="Wingdings" w:hAnsi="Wingdings" w:hint="default"/>
-        <w:sz w:val="20"/>
-      </w:rPr>
-    </w:lvl>
-    <w:lvl w:ilvl="6" w:tentative="1">
-      <w:start w:val="1"/>
-      <w:numFmt w:val="bullet"/>
-      <w:lvlText w:val=""/>
-      <w:lvlJc w:val="left"/>
-      <w:pPr>
-        <w:tabs>
-          <w:tab w:val="num" w:pos="5040"/>
-        </w:tabs>
-        <w:ind w:left="5040" w:hanging="360"/>
-      </w:pPr>
-      <w:rPr>
-        <w:rFonts w:ascii="Wingdings" w:hAnsi="Wingdings" w:hint="default"/>
-        <w:sz w:val="20"/>
-      </w:rPr>
-    </w:lvl>
-    <w:lvl w:ilvl="7" w:tentative="1">
-      <w:start w:val="1"/>
-      <w:numFmt w:val="bullet"/>
-      <w:lvlText w:val=""/>
-      <w:lvlJc w:val="left"/>
-      <w:pPr>
-        <w:tabs>
-          <w:tab w:val="num" w:pos="5760"/>
-        </w:tabs>
-        <w:ind w:left="5760" w:hanging="360"/>
-      </w:pPr>
-      <w:rPr>
-        <w:rFonts w:ascii="Wingdings" w:hAnsi="Wingdings" w:hint="default"/>
-        <w:sz w:val="20"/>
-      </w:rPr>
-    </w:lvl>
-    <w:lvl w:ilvl="8" w:tentative="1">
-      <w:start w:val="1"/>
-      <w:numFmt w:val="bullet"/>
-      <w:lvlText w:val=""/>
-      <w:lvlJc w:val="left"/>
-      <w:pPr>
-        <w:tabs>
-          <w:tab w:val="num" w:pos="6480"/>
-        </w:tabs>
-        <w:ind w:left="6480" w:hanging="360"/>
-      </w:pPr>
-      <w:rPr>
-        <w:rFonts w:ascii="Wingdings" w:hAnsi="Wingdings" w:hint="default"/>
-        <w:sz w:val="20"/>
-      </w:rPr>
-    </w:lvl>
-  </w:abstractNum>
-  <w:num w:numId="1" w16cid:durableId="794370039">
+  <w:num w:numId="1" w16cid:durableId="121189760">
     <w:abstractNumId w:val="8"/>
   </w:num>
-  <w:num w:numId="2" w16cid:durableId="1493062356">
+  <w:num w:numId="2" w16cid:durableId="195167675">
     <w:abstractNumId w:val="6"/>
   </w:num>
-  <w:num w:numId="3" w16cid:durableId="1897474035">
+  <w:num w:numId="3" w16cid:durableId="712193017">
     <w:abstractNumId w:val="5"/>
   </w:num>
-  <w:num w:numId="4" w16cid:durableId="1214391871">
+  <w:num w:numId="4" w16cid:durableId="2024553308">
     <w:abstractNumId w:val="4"/>
   </w:num>
-  <w:num w:numId="5" w16cid:durableId="903296440">
+  <w:num w:numId="5" w16cid:durableId="130371348">
     <w:abstractNumId w:val="7"/>
   </w:num>
-  <w:num w:numId="6" w16cid:durableId="532037137">
+  <w:num w:numId="6" w16cid:durableId="1920862913">
     <w:abstractNumId w:val="3"/>
   </w:num>
-  <w:num w:numId="7" w16cid:durableId="21252763">
+  <w:num w:numId="7" w16cid:durableId="185951592">
     <w:abstractNumId w:val="2"/>
   </w:num>
-  <w:num w:numId="8" w16cid:durableId="2086688031">
+  <w:num w:numId="8" w16cid:durableId="963804642">
     <w:abstractNumId w:val="1"/>
   </w:num>
-  <w:num w:numId="9" w16cid:durableId="1808427828">
+  <w:num w:numId="9" w16cid:durableId="437220326">
     <w:abstractNumId w:val="0"/>
-  </w:num>
-  <w:num w:numId="10" w16cid:durableId="2096199965">
-    <w:abstractNumId w:val="9"/>
-  </w:num>
-  <w:num w:numId="11" w16cid:durableId="83309123">
-    <w:abstractNumId w:val="9"/>
   </w:num>
 </w:numbering>
 </file>
@@ -2870,9 +1306,13 @@
     <w:name w:val="Normal"/>
     <w:qFormat/>
     <w:rsid w:val="00FC693F"/>
+    <w:pPr>
+      <w:spacing w:after="0" w:line="257" w:lineRule="auto"/>
+    </w:pPr>
     <w:rPr>
-      <w:rFonts w:ascii="Aptos" w:hAnsi="Aptos"/>
-      <w:sz w:val="21"/>
+      <w:rFonts w:ascii="Arial" w:hAnsi="Arial"/>
+      <w:color w:val="000000"/>
+      <w:sz w:val="18"/>
     </w:rPr>
   </w:style>
   <w:style w:type="paragraph" w:styleId="Heading1">
@@ -2886,7 +1326,7 @@
     <w:pPr>
       <w:keepNext/>
       <w:keepLines/>
-      <w:spacing w:before="480" w:after="0"/>
+      <w:spacing w:before="480"/>
       <w:outlineLvl w:val="0"/>
     </w:pPr>
     <w:rPr>
@@ -2910,7 +1350,7 @@
     <w:pPr>
       <w:keepNext/>
       <w:keepLines/>
-      <w:spacing w:before="200" w:after="0"/>
+      <w:spacing w:before="200"/>
       <w:outlineLvl w:val="1"/>
     </w:pPr>
     <w:rPr>
@@ -2934,7 +1374,7 @@
     <w:pPr>
       <w:keepNext/>
       <w:keepLines/>
-      <w:spacing w:before="200" w:after="0"/>
+      <w:spacing w:before="200"/>
       <w:outlineLvl w:val="2"/>
     </w:pPr>
     <w:rPr>
@@ -2957,7 +1397,7 @@
     <w:pPr>
       <w:keepNext/>
       <w:keepLines/>
-      <w:spacing w:before="200" w:after="0"/>
+      <w:spacing w:before="200"/>
       <w:outlineLvl w:val="3"/>
     </w:pPr>
     <w:rPr>
@@ -2982,7 +1422,7 @@
     <w:pPr>
       <w:keepNext/>
       <w:keepLines/>
-      <w:spacing w:before="200" w:after="0"/>
+      <w:spacing w:before="200"/>
       <w:outlineLvl w:val="4"/>
     </w:pPr>
     <w:rPr>
@@ -3003,7 +1443,7 @@
     <w:pPr>
       <w:keepNext/>
       <w:keepLines/>
-      <w:spacing w:before="200" w:after="0"/>
+      <w:spacing w:before="200"/>
       <w:outlineLvl w:val="5"/>
     </w:pPr>
     <w:rPr>
@@ -3026,7 +1466,7 @@
     <w:pPr>
       <w:keepNext/>
       <w:keepLines/>
-      <w:spacing w:before="200" w:after="0"/>
+      <w:spacing w:before="200"/>
       <w:outlineLvl w:val="6"/>
     </w:pPr>
     <w:rPr>
@@ -3049,7 +1489,7 @@
     <w:pPr>
       <w:keepNext/>
       <w:keepLines/>
-      <w:spacing w:before="200" w:after="0"/>
+      <w:spacing w:before="200"/>
       <w:outlineLvl w:val="7"/>
     </w:pPr>
     <w:rPr>
@@ -3072,7 +1512,7 @@
     <w:pPr>
       <w:keepNext/>
       <w:keepLines/>
-      <w:spacing w:before="200" w:after="0"/>
+      <w:spacing w:before="200"/>
       <w:outlineLvl w:val="8"/>
     </w:pPr>
     <w:rPr>
@@ -3087,7 +1527,6 @@
   <w:style w:type="character" w:default="1" w:styleId="DefaultParagraphFont">
     <w:name w:val="Default Paragraph Font"/>
     <w:uiPriority w:val="1"/>
-    <w:semiHidden/>
     <w:unhideWhenUsed/>
   </w:style>
   <w:style w:type="table" w:default="1" w:styleId="TableNormal">
@@ -3123,7 +1562,7 @@
         <w:tab w:val="center" w:pos="4680"/>
         <w:tab w:val="right" w:pos="9360"/>
       </w:tabs>
-      <w:spacing w:after="0" w:line="240" w:lineRule="auto"/>
+      <w:spacing w:line="240" w:lineRule="auto"/>
     </w:pPr>
   </w:style>
   <w:style w:type="character" w:customStyle="1" w:styleId="HeaderChar">
@@ -3145,7 +1584,7 @@
         <w:tab w:val="center" w:pos="4680"/>
         <w:tab w:val="right" w:pos="9360"/>
       </w:tabs>
-      <w:spacing w:after="0" w:line="240" w:lineRule="auto"/>
+      <w:spacing w:line="240" w:lineRule="auto"/>
     </w:pPr>
   </w:style>
   <w:style w:type="character" w:customStyle="1" w:styleId="FooterChar">
@@ -3668,7 +2107,6 @@
       <w:b/>
       <w:bCs/>
       <w:color w:val="4F81BD" w:themeColor="accent1"/>
-      <w:sz w:val="18"/>
       <w:szCs w:val="18"/>
     </w:rPr>
   </w:style>
@@ -13864,14 +12302,123 @@
       </w:tcPr>
     </w:tblStylePr>
   </w:style>
+  <w:style w:type="paragraph" w:customStyle="1" w:styleId="CVNameX">
+    <w:name w:val="CV NameX"/>
+    <w:basedOn w:val="Normal"/>
+    <w:pPr>
+      <w:keepNext/>
+      <w:spacing w:after="30"/>
+      <w:jc w:val="center"/>
+    </w:pPr>
+    <w:rPr>
+      <w:b/>
+      <w:sz w:val="33"/>
+    </w:rPr>
+  </w:style>
+  <w:style w:type="paragraph" w:customStyle="1" w:styleId="CVContactX">
+    <w:name w:val="CV ContactX"/>
+    <w:basedOn w:val="Normal"/>
+    <w:pPr>
+      <w:keepNext/>
+      <w:spacing w:after="24"/>
+      <w:jc w:val="center"/>
+    </w:pPr>
+    <w:rPr>
+      <w:sz w:val="16"/>
+    </w:rPr>
+  </w:style>
+  <w:style w:type="paragraph" w:customStyle="1" w:styleId="CVHeadlineX">
+    <w:name w:val="CV HeadlineX"/>
+    <w:basedOn w:val="Normal"/>
+    <w:pPr>
+      <w:keepNext/>
+      <w:spacing w:before="60" w:after="120"/>
+      <w:jc w:val="center"/>
+    </w:pPr>
+    <w:rPr>
+      <w:b/>
+      <w:sz w:val="19"/>
+    </w:rPr>
+  </w:style>
+  <w:style w:type="paragraph" w:customStyle="1" w:styleId="CVSectionX">
+    <w:name w:val="CV SectionX"/>
+    <w:basedOn w:val="Normal"/>
+    <w:pPr>
+      <w:keepNext/>
+      <w:spacing w:before="150" w:after="60"/>
+    </w:pPr>
+    <w:rPr>
+      <w:b/>
+      <w:sz w:val="20"/>
+    </w:rPr>
+  </w:style>
+  <w:style w:type="paragraph" w:customStyle="1" w:styleId="CVBodyX">
+    <w:name w:val="CV BodyX"/>
+    <w:basedOn w:val="Normal"/>
+    <w:pPr>
+      <w:spacing w:after="80"/>
+    </w:pPr>
+  </w:style>
+  <w:style w:type="paragraph" w:customStyle="1" w:styleId="CVSkillsX">
+    <w:name w:val="CV SkillsX"/>
+    <w:basedOn w:val="Normal"/>
+    <w:pPr>
+      <w:spacing w:after="60"/>
+    </w:pPr>
+  </w:style>
+  <w:style w:type="paragraph" w:customStyle="1" w:styleId="CVJobX">
+    <w:name w:val="CV JobX"/>
+    <w:basedOn w:val="Normal"/>
+    <w:pPr>
+      <w:keepNext/>
+      <w:spacing w:before="146" w:after="60"/>
+    </w:pPr>
+    <w:rPr>
+      <w:b/>
+      <w:sz w:val="19"/>
+    </w:rPr>
+  </w:style>
+  <w:style w:type="paragraph" w:customStyle="1" w:styleId="CVBulletX">
+    <w:name w:val="CV BulletX"/>
+    <w:basedOn w:val="Normal"/>
+    <w:pPr>
+      <w:spacing w:after="40"/>
+      <w:ind w:left="259" w:hanging="202"/>
+    </w:pPr>
+  </w:style>
+  <w:style w:type="paragraph" w:customStyle="1" w:styleId="CVCertX">
+    <w:name w:val="CV CertX"/>
+    <w:basedOn w:val="Normal"/>
+    <w:pPr>
+      <w:spacing w:after="40"/>
+    </w:pPr>
+  </w:style>
+  <w:style w:type="paragraph" w:customStyle="1" w:styleId="CVEduX">
+    <w:name w:val="CV EduX"/>
+    <w:basedOn w:val="Normal"/>
+    <w:pPr>
+      <w:spacing w:after="40"/>
+    </w:pPr>
+  </w:style>
+  <w:style w:type="paragraph" w:customStyle="1" w:styleId="CVProjectX">
+    <w:name w:val="CV ProjectX"/>
+    <w:basedOn w:val="Normal"/>
+    <w:pPr>
+      <w:keepNext/>
+      <w:spacing w:before="100" w:after="40"/>
+    </w:pPr>
+    <w:rPr>
+      <w:b/>
+    </w:rPr>
+  </w:style>
   <w:style w:type="character" w:styleId="Hyperlink">
     <w:name w:val="Hyperlink"/>
     <w:basedOn w:val="DefaultParagraphFont"/>
     <w:uiPriority w:val="99"/>
     <w:unhideWhenUsed/>
-    <w:rsid w:val="00CA2C1D"/>
+    <w:rsid w:val="00CF3760"/>
     <w:rPr>
-      <w:color w:val="0000FF"/>
+      <w:color w:val="0000FF" w:themeColor="hyperlink"/>
       <w:u w:val="single"/>
     </w:rPr>
   </w:style>
@@ -13881,7 +12428,7 @@
     <w:uiPriority w:val="99"/>
     <w:semiHidden/>
     <w:unhideWhenUsed/>
-    <w:rsid w:val="004A293A"/>
+    <w:rsid w:val="00CF3760"/>
     <w:rPr>
       <w:color w:val="605E5C"/>
       <w:shd w:val="clear" w:color="auto" w:fill="E1DFDD"/>

</xml_diff>